<commit_message>
team details in report
</commit_message>
<xml_diff>
--- a/report/Project_Report.docx
+++ b/report/Project_Report.docx
@@ -34,7 +34,16 @@
           <w:b w:val="0"/>
           <w:i w:val="0"/>
         </w:rPr>
-        <w:t>Team members: &lt;Name 1 (Reg. No.)&gt;, &lt;Name 2 (Reg. No.)&gt;, &lt;Name 3 (Reg. No.)&gt;</w:t>
+        <w:t>Team members: Abhijay Shrivastava (2430030333), Aarush Dayal (2430030303)</w:t>
+      </w:r>
+    </w:p>
+    <w:p>
+      <w:r>
+        <w:rPr>
+          <w:b w:val="0"/>
+          <w:i w:val="0"/>
+        </w:rPr>
+        <w:t>Section: Soft Computing D</w:t>
       </w:r>
     </w:p>
     <w:p>

</xml_diff>

<commit_message>
report header cleanup, clickable repo link
</commit_message>
<xml_diff>
--- a/report/Project_Report.docx
+++ b/report/Project_Report.docx
@@ -48,21 +48,17 @@
     </w:p>
     <w:p>
       <w:r>
-        <w:rPr>
-          <w:b w:val="0"/>
-          <w:i w:val="0"/>
-        </w:rPr>
-        <w:t>Course coordinator: Dr. Sulabh Bansal</w:t>
+        <w:t xml:space="preserve">Code repository: </w:t>
       </w:r>
-    </w:p>
-    <w:p>
-      <w:r>
-        <w:rPr>
-          <w:b w:val="0"/>
-          <w:i w:val="0"/>
-        </w:rPr>
-        <w:t>Code repository: https://github.com/Abhijay09/Softcomputing-project</w:t>
-      </w:r>
+      <w:hyperlink r:id="rId9">
+        <w:r>
+          <w:rPr>
+            <w:color w:val="0563C1"/>
+            <w:u w:val="single"/>
+          </w:rPr>
+          <w:t>https://github.com/Abhijay09/Softcomputing-project</w:t>
+        </w:r>
+      </w:hyperlink>
     </w:p>
     <w:p>
       <w:pPr>
@@ -304,7 +300,7 @@
                     <pic:cNvPicPr/>
                   </pic:nvPicPr>
                   <pic:blipFill>
-                    <a:blip r:embed="rId9"/>
+                    <a:blip r:embed="rId10"/>
                     <a:stretch>
                       <a:fillRect/>
                     </a:stretch>
@@ -590,7 +586,7 @@
                     <pic:cNvPicPr/>
                   </pic:nvPicPr>
                   <pic:blipFill>
-                    <a:blip r:embed="rId10"/>
+                    <a:blip r:embed="rId11"/>
                     <a:stretch>
                       <a:fillRect/>
                     </a:stretch>
@@ -657,7 +653,7 @@
                     <pic:cNvPicPr/>
                   </pic:nvPicPr>
                   <pic:blipFill>
-                    <a:blip r:embed="rId11"/>
+                    <a:blip r:embed="rId12"/>
                     <a:stretch>
                       <a:fillRect/>
                     </a:stretch>
@@ -1011,7 +1007,7 @@
                     <pic:cNvPicPr/>
                   </pic:nvPicPr>
                   <pic:blipFill>
-                    <a:blip r:embed="rId12"/>
+                    <a:blip r:embed="rId13"/>
                     <a:stretch>
                       <a:fillRect/>
                     </a:stretch>
@@ -1061,7 +1057,7 @@
                     <pic:cNvPicPr/>
                   </pic:nvPicPr>
                   <pic:blipFill>
-                    <a:blip r:embed="rId13"/>
+                    <a:blip r:embed="rId14"/>
                     <a:stretch>
                       <a:fillRect/>
                     </a:stretch>

</xml_diff>

<commit_message>
experiments on rules and features, more figures in report
</commit_message>
<xml_diff>
--- a/report/Project_Report.docx
+++ b/report/Project_Report.docx
@@ -220,7 +220,7 @@
           <w:b w:val="0"/>
           <w:i w:val="0"/>
         </w:rPr>
-        <w:t>Step 4 – Reliability controller (Mamdani). Inputs s ∈ [0,1] and γ ∈ [0,1] are fuzzified with triangular sets (Figure 3), nine IF-THEN rules (e.g. IF strength is HIGH AND gap is LARGE THEN reliability is HIGH) are evaluated with AND = min, clipped outputs are joined with max, and the centroid of the result gives ρ ∈ [0,100].</w:t>
+        <w:t>Step 4 – Reliability controller (Mamdani). Inputs s ∈ [0,1] and γ ∈ [0,1] are fuzzified with triangular sets (Figure 4), nine IF-THEN rules (e.g. IF strength is HIGH AND gap is LARGE THEN reliability is HIGH) are evaluated with AND = min, clipped outputs are joined with max, and the centroid of the result gives ρ ∈ [0,100].</w:t>
       </w:r>
     </w:p>
     <w:p>
@@ -349,6 +349,56 @@
     </w:p>
     <w:p>
       <w:pPr>
+        <w:jc w:val="center"/>
+      </w:pPr>
+      <w:r>
+        <w:drawing>
+          <wp:inline xmlns:a="http://schemas.openxmlformats.org/drawingml/2006/main" xmlns:pic="http://schemas.openxmlformats.org/drawingml/2006/picture">
+            <wp:extent cx="5120640" cy="2662733"/>
+            <wp:docPr id="2" name="Picture 2"/>
+            <wp:cNvGraphicFramePr>
+              <a:graphicFrameLocks noChangeAspect="1"/>
+            </wp:cNvGraphicFramePr>
+            <a:graphic>
+              <a:graphicData uri="http://schemas.openxmlformats.org/drawingml/2006/picture">
+                <pic:pic>
+                  <pic:nvPicPr>
+                    <pic:cNvPr id="0" name="samples.png"/>
+                    <pic:cNvPicPr/>
+                  </pic:nvPicPr>
+                  <pic:blipFill>
+                    <a:blip r:embed="rId11"/>
+                    <a:stretch>
+                      <a:fillRect/>
+                    </a:stretch>
+                  </pic:blipFill>
+                  <pic:spPr>
+                    <a:xfrm>
+                      <a:off x="0" y="0"/>
+                      <a:ext cx="5120640" cy="2662733"/>
+                    </a:xfrm>
+                    <a:prstGeom prst="rect"/>
+                  </pic:spPr>
+                </pic:pic>
+              </a:graphicData>
+            </a:graphic>
+          </wp:inline>
+        </w:drawing>
+      </w:r>
+    </w:p>
+    <w:p>
+      <w:pPr>
+        <w:jc w:val="center"/>
+      </w:pPr>
+      <w:r>
+        <w:rPr>
+          <w:i/>
+        </w:rPr>
+        <w:t>Figure 2: EMNIST samples. Each row is one character class written by different people, so the same character varies a lot in shape and thickness.</w:t>
+      </w:r>
+    </w:p>
+    <w:p>
+      <w:pPr>
         <w:pStyle w:val="Heading2"/>
       </w:pPr>
       <w:r>
@@ -361,7 +411,57 @@
           <w:b w:val="0"/>
           <w:i w:val="0"/>
         </w:rPr>
-        <w:t>For each class, its training feature vectors are clustered by fuzzy c-means (FCM, fuzzifier 2, 4 clusters). Unlike k-means, every sample belongs to every cluster with a degree u_{ik} ∈ [0,1], Σ_k u_{ik} = 1. FCM repeats two steps: (a) c_k = Σ u_{ik}² x_i / Σ u_{ik}²; (b) u_{ik} = 1 / Σ_l (d_{ik}/d_{il})². Each cluster becomes one rule: its centre gives c_j and the membership-weighted standard deviation gives σ_j. A floor of 0.3 × the overall standard deviation of feature j is applied, so a rule is never unrealistically narrow. The reason for several rules per class is that one letter has several writing styles (e.g. 4 vs. open-top 4, 7 with or without a bar).</w:t>
+        <w:t>For each class, its training feature vectors are clustered by fuzzy c-means (FCM, fuzzifier 2, 4 clusters). Unlike k-means, every sample belongs to every cluster with a degree u_{ik} ∈ [0,1], Σ_k u_{ik} = 1. FCM repeats two steps: (a) c_k = Σ u_{ik}² x_i / Σ u_{ik}²; (b) u_{ik} = 1 / Σ_l (d_{ik}/d_{il})². Each cluster becomes one rule: its centre gives c_j and the membership-weighted standard deviation gives σ_j. A floor of 0.3 × the overall standard deviation of feature j is applied, so a rule is never unrealistically narrow. The idea behind several rules per class is that one letter has several writing styles (e.g. 4 vs. open-top 4, 7 with or without a bar). Section 4.2 measures how much this actually helps.</w:t>
+      </w:r>
+    </w:p>
+    <w:p>
+      <w:pPr>
+        <w:jc w:val="center"/>
+      </w:pPr>
+      <w:r>
+        <w:drawing>
+          <wp:inline xmlns:a="http://schemas.openxmlformats.org/drawingml/2006/main" xmlns:pic="http://schemas.openxmlformats.org/drawingml/2006/picture">
+            <wp:extent cx="4572000" cy="1371600"/>
+            <wp:docPr id="3" name="Picture 3"/>
+            <wp:cNvGraphicFramePr>
+              <a:graphicFrameLocks noChangeAspect="1"/>
+            </wp:cNvGraphicFramePr>
+            <a:graphic>
+              <a:graphicData uri="http://schemas.openxmlformats.org/drawingml/2006/picture">
+                <pic:pic>
+                  <pic:nvPicPr>
+                    <pic:cNvPr id="0" name="rules_A.png"/>
+                    <pic:cNvPicPr/>
+                  </pic:nvPicPr>
+                  <pic:blipFill>
+                    <a:blip r:embed="rId12"/>
+                    <a:stretch>
+                      <a:fillRect/>
+                    </a:stretch>
+                  </pic:blipFill>
+                  <pic:spPr>
+                    <a:xfrm>
+                      <a:off x="0" y="0"/>
+                      <a:ext cx="4572000" cy="1371600"/>
+                    </a:xfrm>
+                    <a:prstGeom prst="rect"/>
+                  </pic:spPr>
+                </pic:pic>
+              </a:graphicData>
+            </a:graphic>
+          </wp:inline>
+        </w:drawing>
+      </w:r>
+    </w:p>
+    <w:p>
+      <w:pPr>
+        <w:jc w:val="center"/>
+      </w:pPr>
+      <w:r>
+        <w:rPr>
+          <w:i/>
+        </w:rPr>
+        <w:t>Figure 3: the four fuzzy rules learned for the letter A (ink-zone part of each rule centre). The four rules turn out to be very similar to each other, which matches the experiment in Section 4.2 where extra rules help only a little.</w:t>
       </w:r>
     </w:p>
     <w:p>
@@ -574,7 +674,7 @@
         <w:drawing>
           <wp:inline xmlns:a="http://schemas.openxmlformats.org/drawingml/2006/main" xmlns:pic="http://schemas.openxmlformats.org/drawingml/2006/picture">
             <wp:extent cx="5943600" cy="1188720"/>
-            <wp:docPr id="2" name="Picture 2"/>
+            <wp:docPr id="4" name="Picture 4"/>
             <wp:cNvGraphicFramePr>
               <a:graphicFrameLocks noChangeAspect="1"/>
             </wp:cNvGraphicFramePr>
@@ -586,7 +686,7 @@
                     <pic:cNvPicPr/>
                   </pic:nvPicPr>
                   <pic:blipFill>
-                    <a:blip r:embed="rId11"/>
+                    <a:blip r:embed="rId13"/>
                     <a:stretch>
                       <a:fillRect/>
                     </a:stretch>
@@ -613,7 +713,7 @@
         <w:rPr>
           <w:i/>
         </w:rPr>
-        <w:t>Figure 2/3: membership functions of the reliability controller and the distribution of ρ on the test set</w:t>
+        <w:t>Figure 4: membership functions of the reliability controller and the distribution of ρ on the test set</w:t>
       </w:r>
     </w:p>
     <w:p>
@@ -640,8 +740,58 @@
       <w:r>
         <w:drawing>
           <wp:inline xmlns:a="http://schemas.openxmlformats.org/drawingml/2006/main" xmlns:pic="http://schemas.openxmlformats.org/drawingml/2006/picture">
+            <wp:extent cx="5669280" cy="3342736"/>
+            <wp:docPr id="5" name="Picture 5"/>
+            <wp:cNvGraphicFramePr>
+              <a:graphicFrameLocks noChangeAspect="1"/>
+            </wp:cNvGraphicFramePr>
+            <a:graphic>
+              <a:graphicData uri="http://schemas.openxmlformats.org/drawingml/2006/picture">
+                <pic:pic>
+                  <pic:nvPicPr>
+                    <pic:cNvPr id="0" name="app_window.png"/>
+                    <pic:cNvPicPr/>
+                  </pic:nvPicPr>
+                  <pic:blipFill>
+                    <a:blip r:embed="rId14"/>
+                    <a:stretch>
+                      <a:fillRect/>
+                    </a:stretch>
+                  </pic:blipFill>
+                  <pic:spPr>
+                    <a:xfrm>
+                      <a:off x="0" y="0"/>
+                      <a:ext cx="5669280" cy="3342736"/>
+                    </a:xfrm>
+                    <a:prstGeom prst="rect"/>
+                  </pic:spPr>
+                </pic:pic>
+              </a:graphicData>
+            </a:graphic>
+          </wp:inline>
+        </w:drawing>
+      </w:r>
+    </w:p>
+    <w:p>
+      <w:pPr>
+        <w:jc w:val="center"/>
+      </w:pPr>
+      <w:r>
+        <w:rPr>
+          <w:i/>
+        </w:rPr>
+        <w:t>Figure 5: the Tkinter application reading a still image (Open image… mode). In camera mode the left panel shows the live feed instead. Box colour = reliability level; the panel on the right lists the three best classes and their membership for each character.</w:t>
+      </w:r>
+    </w:p>
+    <w:p>
+      <w:pPr>
+        <w:jc w:val="center"/>
+      </w:pPr>
+      <w:r>
+        <w:drawing>
+          <wp:inline xmlns:a="http://schemas.openxmlformats.org/drawingml/2006/main" xmlns:pic="http://schemas.openxmlformats.org/drawingml/2006/picture">
             <wp:extent cx="5943600" cy="2834640"/>
-            <wp:docPr id="3" name="Picture 3"/>
+            <wp:docPr id="6" name="Picture 6"/>
             <wp:cNvGraphicFramePr>
               <a:graphicFrameLocks noChangeAspect="1"/>
             </wp:cNvGraphicFramePr>
@@ -653,7 +803,7 @@
                     <pic:cNvPicPr/>
                   </pic:nvPicPr>
                   <pic:blipFill>
-                    <a:blip r:embed="rId12"/>
+                    <a:blip r:embed="rId15"/>
                     <a:stretch>
                       <a:fillRect/>
                     </a:stretch>
@@ -680,7 +830,7 @@
         <w:rPr>
           <w:i/>
         </w:rPr>
-        <w:t>Figure 4: pipeline on a sample image (characters taken from the EMNIST test set and placed on a paper-like background)</w:t>
+        <w:t>Figure 6: pipeline on a sample image (characters taken from the EMNIST test set and placed on a paper-like background)</w:t>
       </w:r>
     </w:p>
     <w:p>
@@ -689,6 +839,14 @@
       </w:pPr>
       <w:r>
         <w:t>4. Results (progress till date)</w:t>
+      </w:r>
+    </w:p>
+    <w:p>
+      <w:pPr>
+        <w:pStyle w:val="Heading2"/>
+      </w:pPr>
+      <w:r>
+        <w:t>4.1 Accuracy and reliability</w:t>
       </w:r>
     </w:p>
     <w:tbl>
@@ -995,7 +1153,7 @@
         <w:drawing>
           <wp:inline xmlns:a="http://schemas.openxmlformats.org/drawingml/2006/main" xmlns:pic="http://schemas.openxmlformats.org/drawingml/2006/picture">
             <wp:extent cx="4754880" cy="4226560"/>
-            <wp:docPr id="4" name="Picture 4"/>
+            <wp:docPr id="7" name="Picture 7"/>
             <wp:cNvGraphicFramePr>
               <a:graphicFrameLocks noChangeAspect="1"/>
             </wp:cNvGraphicFramePr>
@@ -1007,7 +1165,7 @@
                     <pic:cNvPicPr/>
                   </pic:nvPicPr>
                   <pic:blipFill>
-                    <a:blip r:embed="rId13"/>
+                    <a:blip r:embed="rId16"/>
                     <a:stretch>
                       <a:fillRect/>
                     </a:stretch>
@@ -1034,7 +1192,7 @@
         <w:rPr>
           <w:i/>
         </w:rPr>
-        <w:t>Figure 5: confusion matrix</w:t>
+        <w:t>Figure 7: confusion matrix</w:t>
       </w:r>
     </w:p>
     <w:p>
@@ -1045,7 +1203,7 @@
         <w:drawing>
           <wp:inline xmlns:a="http://schemas.openxmlformats.org/drawingml/2006/main" xmlns:pic="http://schemas.openxmlformats.org/drawingml/2006/picture">
             <wp:extent cx="5760720" cy="1920240"/>
-            <wp:docPr id="5" name="Picture 5"/>
+            <wp:docPr id="8" name="Picture 8"/>
             <wp:cNvGraphicFramePr>
               <a:graphicFrameLocks noChangeAspect="1"/>
             </wp:cNvGraphicFramePr>
@@ -1057,7 +1215,7 @@
                     <pic:cNvPicPr/>
                   </pic:nvPicPr>
                   <pic:blipFill>
-                    <a:blip r:embed="rId14"/>
+                    <a:blip r:embed="rId17"/>
                     <a:stretch>
                       <a:fillRect/>
                     </a:stretch>
@@ -1084,7 +1242,7 @@
         <w:rPr>
           <w:i/>
         </w:rPr>
-        <w:t>Figure 6: accuracy per class</w:t>
+        <w:t>Figure 8: accuracy per class</w:t>
       </w:r>
     </w:p>
     <w:p>
@@ -1094,6 +1252,316 @@
           <w:i w:val="0"/>
         </w:rPr>
         <w:t>Observations. Most errors are between look-alike shapes: 9/q/g, F/f, 1/I/L, O/0, e/a and 3/B (the most frequent confusions in our test run). This is the inherent imprecision that motivated the fuzzy approach; the top-3 accuracy shows that the correct character is almost always among the top candidates.</w:t>
+      </w:r>
+    </w:p>
+    <w:p>
+      <w:pPr>
+        <w:pStyle w:val="Heading2"/>
+      </w:pPr>
+      <w:r>
+        <w:t>4.2 Experiments: what actually matters?</w:t>
+      </w:r>
+    </w:p>
+    <w:p>
+      <w:r>
+        <w:rPr>
+          <w:b w:val="0"/>
+          <w:i w:val="0"/>
+        </w:rPr>
+        <w:t>To understand which design choices matter, we changed one thing at a time and measured test accuracy.</w:t>
+      </w:r>
+    </w:p>
+    <w:tbl>
+      <w:tblPr>
+        <w:tblStyle w:val="LightGrid-Accent1"/>
+        <w:tblW w:type="auto" w:w="0"/>
+        <w:tblLook w:firstColumn="1" w:firstRow="1" w:lastColumn="0" w:lastRow="0" w:noHBand="0" w:noVBand="1" w:val="04A0"/>
+      </w:tblPr>
+      <w:tblGrid>
+        <w:gridCol w:w="4320"/>
+        <w:gridCol w:w="4320"/>
+      </w:tblGrid>
+      <w:tr>
+        <w:tc>
+          <w:tcPr>
+            <w:tcW w:type="dxa" w:w="4320"/>
+          </w:tcPr>
+          <w:p>
+            <w:r>
+              <w:rPr>
+                <w:b/>
+              </w:rPr>
+              <w:t>Rules per class</w:t>
+            </w:r>
+          </w:p>
+        </w:tc>
+        <w:tc>
+          <w:tcPr>
+            <w:tcW w:type="dxa" w:w="4320"/>
+          </w:tcPr>
+          <w:p>
+            <w:r>
+              <w:rPr>
+                <w:b/>
+              </w:rPr>
+              <w:t>Test accuracy</w:t>
+            </w:r>
+          </w:p>
+        </w:tc>
+      </w:tr>
+      <w:tr>
+        <w:tc>
+          <w:tcPr>
+            <w:tcW w:type="dxa" w:w="4320"/>
+          </w:tcPr>
+          <w:p>
+            <w:r>
+              <w:t>1</w:t>
+            </w:r>
+          </w:p>
+        </w:tc>
+        <w:tc>
+          <w:tcPr>
+            <w:tcW w:type="dxa" w:w="4320"/>
+          </w:tcPr>
+          <w:p>
+            <w:r>
+              <w:t>65.9%</w:t>
+            </w:r>
+          </w:p>
+        </w:tc>
+      </w:tr>
+      <w:tr>
+        <w:tc>
+          <w:tcPr>
+            <w:tcW w:type="dxa" w:w="4320"/>
+          </w:tcPr>
+          <w:p>
+            <w:r>
+              <w:t>2</w:t>
+            </w:r>
+          </w:p>
+        </w:tc>
+        <w:tc>
+          <w:tcPr>
+            <w:tcW w:type="dxa" w:w="4320"/>
+          </w:tcPr>
+          <w:p>
+            <w:r>
+              <w:t>66.2%</w:t>
+            </w:r>
+          </w:p>
+        </w:tc>
+      </w:tr>
+      <w:tr>
+        <w:tc>
+          <w:tcPr>
+            <w:tcW w:type="dxa" w:w="4320"/>
+          </w:tcPr>
+          <w:p>
+            <w:r>
+              <w:t>4</w:t>
+            </w:r>
+          </w:p>
+        </w:tc>
+        <w:tc>
+          <w:tcPr>
+            <w:tcW w:type="dxa" w:w="4320"/>
+          </w:tcPr>
+          <w:p>
+            <w:r>
+              <w:t>66.3%</w:t>
+            </w:r>
+          </w:p>
+        </w:tc>
+      </w:tr>
+      <w:tr>
+        <w:tc>
+          <w:tcPr>
+            <w:tcW w:type="dxa" w:w="4320"/>
+          </w:tcPr>
+          <w:p>
+            <w:r>
+              <w:t>8</w:t>
+            </w:r>
+          </w:p>
+        </w:tc>
+        <w:tc>
+          <w:tcPr>
+            <w:tcW w:type="dxa" w:w="4320"/>
+          </w:tcPr>
+          <w:p>
+            <w:r>
+              <w:t>66.5%</w:t>
+            </w:r>
+          </w:p>
+        </w:tc>
+      </w:tr>
+    </w:tbl>
+    <w:p/>
+    <w:tbl>
+      <w:tblPr>
+        <w:tblStyle w:val="LightGrid-Accent1"/>
+        <w:tblW w:type="auto" w:w="0"/>
+        <w:tblLook w:firstColumn="1" w:firstRow="1" w:lastColumn="0" w:lastRow="0" w:noHBand="0" w:noVBand="1" w:val="04A0"/>
+      </w:tblPr>
+      <w:tblGrid>
+        <w:gridCol w:w="4320"/>
+        <w:gridCol w:w="4320"/>
+      </w:tblGrid>
+      <w:tr>
+        <w:tc>
+          <w:tcPr>
+            <w:tcW w:type="dxa" w:w="4320"/>
+          </w:tcPr>
+          <w:p>
+            <w:r>
+              <w:rPr>
+                <w:b/>
+              </w:rPr>
+              <w:t>Features used (4 rules per class)</w:t>
+            </w:r>
+          </w:p>
+        </w:tc>
+        <w:tc>
+          <w:tcPr>
+            <w:tcW w:type="dxa" w:w="4320"/>
+          </w:tcPr>
+          <w:p>
+            <w:r>
+              <w:rPr>
+                <w:b/>
+              </w:rPr>
+              <w:t>Test accuracy</w:t>
+            </w:r>
+          </w:p>
+        </w:tc>
+      </w:tr>
+      <w:tr>
+        <w:tc>
+          <w:tcPr>
+            <w:tcW w:type="dxa" w:w="4320"/>
+          </w:tcPr>
+          <w:p>
+            <w:r>
+              <w:t>ink zones only (49)</w:t>
+            </w:r>
+          </w:p>
+        </w:tc>
+        <w:tc>
+          <w:tcPr>
+            <w:tcW w:type="dxa" w:w="4320"/>
+          </w:tcPr>
+          <w:p>
+            <w:r>
+              <w:t>50.2%</w:t>
+            </w:r>
+          </w:p>
+        </w:tc>
+      </w:tr>
+      <w:tr>
+        <w:tc>
+          <w:tcPr>
+            <w:tcW w:type="dxa" w:w="4320"/>
+          </w:tcPr>
+          <w:p>
+            <w:r>
+              <w:t>stroke directions only (128)</w:t>
+            </w:r>
+          </w:p>
+        </w:tc>
+        <w:tc>
+          <w:tcPr>
+            <w:tcW w:type="dxa" w:w="4320"/>
+          </w:tcPr>
+          <w:p>
+            <w:r>
+              <w:t>65.5%</w:t>
+            </w:r>
+          </w:p>
+        </w:tc>
+      </w:tr>
+      <w:tr>
+        <w:tc>
+          <w:tcPr>
+            <w:tcW w:type="dxa" w:w="4320"/>
+          </w:tcPr>
+          <w:p>
+            <w:r>
+              <w:t>both (177)</w:t>
+            </w:r>
+          </w:p>
+        </w:tc>
+        <w:tc>
+          <w:tcPr>
+            <w:tcW w:type="dxa" w:w="4320"/>
+          </w:tcPr>
+          <w:p>
+            <w:r>
+              <w:t>66.3%</w:t>
+            </w:r>
+          </w:p>
+        </w:tc>
+      </w:tr>
+    </w:tbl>
+    <w:p/>
+    <w:p>
+      <w:pPr>
+        <w:jc w:val="center"/>
+      </w:pPr>
+      <w:r>
+        <w:drawing>
+          <wp:inline xmlns:a="http://schemas.openxmlformats.org/drawingml/2006/main" xmlns:pic="http://schemas.openxmlformats.org/drawingml/2006/picture">
+            <wp:extent cx="5760720" cy="1843430"/>
+            <wp:docPr id="9" name="Picture 9"/>
+            <wp:cNvGraphicFramePr>
+              <a:graphicFrameLocks noChangeAspect="1"/>
+            </wp:cNvGraphicFramePr>
+            <a:graphic>
+              <a:graphicData uri="http://schemas.openxmlformats.org/drawingml/2006/picture">
+                <pic:pic>
+                  <pic:nvPicPr>
+                    <pic:cNvPr id="0" name="experiments.png"/>
+                    <pic:cNvPicPr/>
+                  </pic:nvPicPr>
+                  <pic:blipFill>
+                    <a:blip r:embed="rId18"/>
+                    <a:stretch>
+                      <a:fillRect/>
+                    </a:stretch>
+                  </pic:blipFill>
+                  <pic:spPr>
+                    <a:xfrm>
+                      <a:off x="0" y="0"/>
+                      <a:ext cx="5760720" cy="1843430"/>
+                    </a:xfrm>
+                    <a:prstGeom prst="rect"/>
+                  </pic:spPr>
+                </pic:pic>
+              </a:graphicData>
+            </a:graphic>
+          </wp:inline>
+        </w:drawing>
+      </w:r>
+    </w:p>
+    <w:p>
+      <w:pPr>
+        <w:jc w:val="center"/>
+      </w:pPr>
+      <w:r>
+        <w:rPr>
+          <w:i/>
+        </w:rPr>
+        <w:t>Figure 9: effect of the number of rules and of the feature type</w:t>
+      </w:r>
+    </w:p>
+    <w:p>
+      <w:r>
+        <w:rPr>
+          <w:b w:val="0"/>
+          <w:i w:val="0"/>
+        </w:rPr>
+        <w:t>Findings. (1) The stroke-direction features carry most of the information: using them alone gives 65.5%, while the ink zones alone give only 50.2%. Adding the ink zones to the directions improves the result slightly. (2) More rules per class helps only a little (65.9% with one rule, 66.5% with eight), so the limit is the feature description and the simple Gaussian membership form, not the number of writing styles. We kept 4 rules per class as a compromise between accuracy and the size of the rule base. These findings point to where improvement should come from next (better features, tuned membership widths).</w:t>
       </w:r>
     </w:p>
     <w:p>

</xml_diff>

<commit_message>
cover page for report
</commit_message>
<xml_diff>
--- a/report/Project_Report.docx
+++ b/report/Project_Report.docx
@@ -4,53 +4,339 @@
   <w:body>
     <w:p>
       <w:pPr>
-        <w:pStyle w:val="Title"/>
+        <w:spacing w:before="600" w:after="280"/>
+        <w:jc w:val="center"/>
       </w:pPr>
       <w:r>
+        <w:rPr>
+          <w:rFonts w:ascii="Arial" w:hAnsi="Arial" w:eastAsia="Arial"/>
+          <w:b/>
+          <w:i w:val="0"/>
+          <w:sz w:val="28"/>
+        </w:rPr>
+        <w:t>A Project Report</w:t>
+      </w:r>
+    </w:p>
+    <w:p>
+      <w:pPr>
+        <w:spacing w:before="0" w:after="280"/>
+        <w:jc w:val="center"/>
+      </w:pPr>
+      <w:r>
+        <w:rPr>
+          <w:rFonts w:ascii="Calibri" w:hAnsi="Calibri" w:eastAsia="Calibri"/>
+          <w:b w:val="0"/>
+          <w:i/>
+          <w:sz w:val="22"/>
+        </w:rPr>
+        <w:t>on</w:t>
+      </w:r>
+    </w:p>
+    <w:p>
+      <w:pPr>
+        <w:spacing w:before="0" w:after="320"/>
+        <w:jc w:val="center"/>
+      </w:pPr>
+      <w:r>
+        <w:rPr>
+          <w:rFonts w:ascii="Arial" w:hAnsi="Arial" w:eastAsia="Arial"/>
+          <w:b/>
+          <w:i w:val="0"/>
+          <w:sz w:val="32"/>
+        </w:rPr>
         <w:t>Detection of Alphanumeric Handwritten Values using Fuzzy Logic</w:t>
       </w:r>
     </w:p>
     <w:p>
+      <w:pPr>
+        <w:spacing w:before="0" w:after="280"/>
+        <w:jc w:val="center"/>
+      </w:pPr>
       <w:r>
         <w:rPr>
+          <w:rFonts w:ascii="Calibri" w:hAnsi="Calibri" w:eastAsia="Calibri"/>
+          <w:b w:val="0"/>
+          <w:i/>
+          <w:sz w:val="22"/>
+        </w:rPr>
+        <w:t xml:space="preserve">carried out as part of the </w:t>
+      </w:r>
+      <w:r>
+        <w:rPr>
+          <w:rFonts w:ascii="Calibri" w:hAnsi="Calibri"/>
           <w:b/>
-          <w:i w:val="0"/>
+          <w:i/>
+          <w:sz w:val="22"/>
         </w:rPr>
-        <w:t>INT3141 – Soft Computing Techniques  |  Project Submission (Intermediate)</w:t>
+        <w:t>Soft Computing Techniques (INT3141)</w:t>
+      </w:r>
+      <w:r>
+        <w:rPr>
+          <w:rFonts w:ascii="Calibri" w:hAnsi="Calibri"/>
+          <w:b w:val="0"/>
+          <w:i/>
+          <w:sz w:val="22"/>
+        </w:rPr>
+        <w:t xml:space="preserve"> Submitted</w:t>
       </w:r>
     </w:p>
     <w:p>
+      <w:pPr>
+        <w:spacing w:before="0" w:after="280"/>
+        <w:jc w:val="center"/>
+      </w:pPr>
       <w:r>
         <w:rPr>
+          <w:rFonts w:ascii="Calibri" w:hAnsi="Calibri" w:eastAsia="Calibri"/>
           <w:b w:val="0"/>
           <w:i w:val="0"/>
+          <w:sz w:val="22"/>
         </w:rPr>
-        <w:t>Manipal University Jaipur, Department of Information Technology, B.Tech IT, V Sem, 2026-27</w:t>
+        <w:t>by</w:t>
       </w:r>
     </w:p>
     <w:p>
+      <w:pPr>
+        <w:spacing w:before="0" w:after="0"/>
+        <w:jc w:val="center"/>
+      </w:pPr>
       <w:r>
         <w:rPr>
-          <w:b w:val="0"/>
+          <w:rFonts w:ascii="Times New Roman" w:hAnsi="Times New Roman" w:eastAsia="Times New Roman"/>
+          <w:b/>
           <w:i w:val="0"/>
+          <w:sz w:val="24"/>
         </w:rPr>
-        <w:t>Team members: Abhijay Shrivastava (2430030333), Aarush Dayal (2430030303)</w:t>
+        <w:t>Abhijay Shrivastava</w:t>
       </w:r>
     </w:p>
     <w:p>
+      <w:pPr>
+        <w:spacing w:before="0" w:after="200"/>
+        <w:jc w:val="center"/>
+      </w:pPr>
       <w:r>
         <w:rPr>
-          <w:b w:val="0"/>
+          <w:rFonts w:ascii="Times New Roman" w:hAnsi="Times New Roman" w:eastAsia="Times New Roman"/>
+          <w:b/>
           <w:i w:val="0"/>
+          <w:sz w:val="24"/>
+        </w:rPr>
+        <w:t>2430030333</w:t>
+      </w:r>
+    </w:p>
+    <w:p>
+      <w:pPr>
+        <w:spacing w:before="0" w:after="0"/>
+        <w:jc w:val="center"/>
+      </w:pPr>
+      <w:r>
+        <w:rPr>
+          <w:rFonts w:ascii="Times New Roman" w:hAnsi="Times New Roman" w:eastAsia="Times New Roman"/>
+          <w:b/>
+          <w:i w:val="0"/>
+          <w:sz w:val="24"/>
+        </w:rPr>
+        <w:t>Aarush Dayal</w:t>
+      </w:r>
+    </w:p>
+    <w:p>
+      <w:pPr>
+        <w:spacing w:before="0" w:after="200"/>
+        <w:jc w:val="center"/>
+      </w:pPr>
+      <w:r>
+        <w:rPr>
+          <w:rFonts w:ascii="Times New Roman" w:hAnsi="Times New Roman" w:eastAsia="Times New Roman"/>
+          <w:b/>
+          <w:i w:val="0"/>
+          <w:sz w:val="24"/>
+        </w:rPr>
+        <w:t>2430030303</w:t>
+      </w:r>
+    </w:p>
+    <w:p>
+      <w:pPr>
+        <w:spacing w:before="0" w:after="720"/>
+        <w:jc w:val="center"/>
+      </w:pPr>
+      <w:r>
+        <w:rPr>
+          <w:rFonts w:ascii="Times New Roman" w:hAnsi="Times New Roman" w:eastAsia="Times New Roman"/>
+          <w:b/>
+          <w:i w:val="0"/>
+          <w:sz w:val="24"/>
         </w:rPr>
         <w:t>Section: Soft Computing D</w:t>
       </w:r>
     </w:p>
     <w:p>
+      <w:pPr>
+        <w:spacing w:before="0" w:after="480"/>
+        <w:jc w:val="center"/>
+      </w:pPr>
+      <w:r>
+        <w:rPr>
+          <w:rFonts w:ascii="Calibri" w:hAnsi="Calibri" w:eastAsia="Calibri"/>
+          <w:b w:val="0"/>
+          <w:i/>
+          <w:sz w:val="22"/>
+        </w:rPr>
+        <w:t>in partial fulfilment for the award of the degree of</w:t>
+      </w:r>
+    </w:p>
+    <w:p>
+      <w:pPr>
+        <w:spacing w:before="0" w:after="280"/>
+        <w:jc w:val="center"/>
+      </w:pPr>
+      <w:r>
+        <w:rPr>
+          <w:rFonts w:ascii="Calibri" w:hAnsi="Calibri" w:eastAsia="Calibri"/>
+          <w:b/>
+          <w:i w:val="0"/>
+          <w:sz w:val="24"/>
+        </w:rPr>
+        <w:t>Bachelor of Technology</w:t>
+      </w:r>
+    </w:p>
+    <w:p>
+      <w:pPr>
+        <w:spacing w:before="0" w:after="200"/>
+        <w:jc w:val="center"/>
+      </w:pPr>
+      <w:r>
+        <w:rPr>
+          <w:rFonts w:ascii="Calibri" w:hAnsi="Calibri" w:eastAsia="Calibri"/>
+          <w:b w:val="0"/>
+          <w:i w:val="0"/>
+          <w:sz w:val="22"/>
+        </w:rPr>
+        <w:t>in</w:t>
+      </w:r>
+    </w:p>
+    <w:p>
+      <w:pPr>
+        <w:spacing w:before="0" w:after="200"/>
+        <w:jc w:val="center"/>
+      </w:pPr>
+      <w:r>
+        <w:rPr>
+          <w:rFonts w:ascii="Calibri" w:hAnsi="Calibri" w:eastAsia="Calibri"/>
+          <w:b/>
+          <w:i w:val="0"/>
+          <w:sz w:val="24"/>
+        </w:rPr>
+        <w:t>Information Technology</w:t>
+      </w:r>
+    </w:p>
+    <w:p>
+      <w:pPr>
+        <w:jc w:val="center"/>
+      </w:pPr>
+      <w:r>
+        <w:drawing>
+          <wp:inline xmlns:a="http://schemas.openxmlformats.org/drawingml/2006/main" xmlns:pic="http://schemas.openxmlformats.org/drawingml/2006/picture">
+            <wp:extent cx="2926080" cy="895886"/>
+            <wp:docPr id="1" name="Picture 1"/>
+            <wp:cNvGraphicFramePr>
+              <a:graphicFrameLocks noChangeAspect="1"/>
+            </wp:cNvGraphicFramePr>
+            <a:graphic>
+              <a:graphicData uri="http://schemas.openxmlformats.org/drawingml/2006/picture">
+                <pic:pic>
+                  <pic:nvPicPr>
+                    <pic:cNvPr id="0" name="logo.png"/>
+                    <pic:cNvPicPr/>
+                  </pic:nvPicPr>
+                  <pic:blipFill>
+                    <a:blip r:embed="rId9"/>
+                    <a:stretch>
+                      <a:fillRect/>
+                    </a:stretch>
+                  </pic:blipFill>
+                  <pic:spPr>
+                    <a:xfrm>
+                      <a:off x="0" y="0"/>
+                      <a:ext cx="2926080" cy="895886"/>
+                    </a:xfrm>
+                    <a:prstGeom prst="rect"/>
+                  </pic:spPr>
+                </pic:pic>
+              </a:graphicData>
+            </a:graphic>
+          </wp:inline>
+        </w:drawing>
+      </w:r>
+    </w:p>
+    <w:p>
+      <w:pPr>
+        <w:spacing w:before="280" w:after="280"/>
+        <w:jc w:val="center"/>
+      </w:pPr>
+      <w:r>
+        <w:rPr>
+          <w:rFonts w:ascii="Times New Roman" w:hAnsi="Times New Roman" w:eastAsia="Times New Roman"/>
+          <w:b/>
+          <w:i w:val="0"/>
+          <w:sz w:val="24"/>
+        </w:rPr>
+        <w:t>Department of Information Technology</w:t>
+      </w:r>
+    </w:p>
+    <w:p>
+      <w:pPr>
+        <w:spacing w:before="0" w:after="0"/>
+        <w:jc w:val="center"/>
+      </w:pPr>
+      <w:r>
+        <w:rPr>
+          <w:rFonts w:ascii="Times New Roman" w:hAnsi="Times New Roman" w:eastAsia="Times New Roman"/>
+          <w:b/>
+          <w:i w:val="0"/>
+          <w:sz w:val="24"/>
+        </w:rPr>
+        <w:t>MANIPAL UNIVERSITY JAIPUR</w:t>
+      </w:r>
+    </w:p>
+    <w:p>
+      <w:pPr>
+        <w:spacing w:before="0" w:after="360"/>
+        <w:jc w:val="center"/>
+      </w:pPr>
+      <w:r>
+        <w:rPr>
+          <w:rFonts w:ascii="Times New Roman" w:hAnsi="Times New Roman" w:eastAsia="Times New Roman"/>
+          <w:b/>
+          <w:i w:val="0"/>
+          <w:sz w:val="24"/>
+        </w:rPr>
+        <w:t>RAJASTHAN, INDIA</w:t>
+      </w:r>
+    </w:p>
+    <w:p>
+      <w:pPr>
+        <w:spacing w:before="0" w:after="0"/>
+        <w:jc w:val="center"/>
+      </w:pPr>
+      <w:r>
+        <w:rPr>
+          <w:rFonts w:ascii="Times New Roman" w:hAnsi="Times New Roman" w:eastAsia="Times New Roman"/>
+          <w:b/>
+          <w:i w:val="0"/>
+          <w:sz w:val="24"/>
+        </w:rPr>
+        <w:t>Oct 2026</w:t>
+      </w:r>
+    </w:p>
+    <w:p>
+      <w:pPr>
+        <w:pageBreakBefore/>
+      </w:pPr>
       <w:r>
         <w:t xml:space="preserve">Code repository: </w:t>
       </w:r>
-      <w:hyperlink r:id="rId9">
+      <w:hyperlink r:id="rId10">
         <w:r>
           <w:rPr>
             <w:color w:val="0563C1"/>
@@ -288,7 +574,7 @@
         <w:drawing>
           <wp:inline xmlns:a="http://schemas.openxmlformats.org/drawingml/2006/main" xmlns:pic="http://schemas.openxmlformats.org/drawingml/2006/picture">
             <wp:extent cx="5943600" cy="1004377"/>
-            <wp:docPr id="1" name="Picture 1"/>
+            <wp:docPr id="2" name="Picture 2"/>
             <wp:cNvGraphicFramePr>
               <a:graphicFrameLocks noChangeAspect="1"/>
             </wp:cNvGraphicFramePr>
@@ -300,7 +586,7 @@
                     <pic:cNvPicPr/>
                   </pic:nvPicPr>
                   <pic:blipFill>
-                    <a:blip r:embed="rId10"/>
+                    <a:blip r:embed="rId11"/>
                     <a:stretch>
                       <a:fillRect/>
                     </a:stretch>
@@ -355,7 +641,7 @@
         <w:drawing>
           <wp:inline xmlns:a="http://schemas.openxmlformats.org/drawingml/2006/main" xmlns:pic="http://schemas.openxmlformats.org/drawingml/2006/picture">
             <wp:extent cx="5120640" cy="2662733"/>
-            <wp:docPr id="2" name="Picture 2"/>
+            <wp:docPr id="3" name="Picture 3"/>
             <wp:cNvGraphicFramePr>
               <a:graphicFrameLocks noChangeAspect="1"/>
             </wp:cNvGraphicFramePr>
@@ -367,7 +653,7 @@
                     <pic:cNvPicPr/>
                   </pic:nvPicPr>
                   <pic:blipFill>
-                    <a:blip r:embed="rId11"/>
+                    <a:blip r:embed="rId12"/>
                     <a:stretch>
                       <a:fillRect/>
                     </a:stretch>
@@ -422,7 +708,7 @@
         <w:drawing>
           <wp:inline xmlns:a="http://schemas.openxmlformats.org/drawingml/2006/main" xmlns:pic="http://schemas.openxmlformats.org/drawingml/2006/picture">
             <wp:extent cx="4572000" cy="1371600"/>
-            <wp:docPr id="3" name="Picture 3"/>
+            <wp:docPr id="4" name="Picture 4"/>
             <wp:cNvGraphicFramePr>
               <a:graphicFrameLocks noChangeAspect="1"/>
             </wp:cNvGraphicFramePr>
@@ -434,7 +720,7 @@
                     <pic:cNvPicPr/>
                   </pic:nvPicPr>
                   <pic:blipFill>
-                    <a:blip r:embed="rId12"/>
+                    <a:blip r:embed="rId13"/>
                     <a:stretch>
                       <a:fillRect/>
                     </a:stretch>
@@ -479,15 +765,15 @@
         <w:tblLook w:firstColumn="1" w:firstRow="1" w:lastColumn="0" w:lastRow="0" w:noHBand="0" w:noVBand="1" w:val="04A0"/>
       </w:tblPr>
       <w:tblGrid>
-        <w:gridCol w:w="2160"/>
-        <w:gridCol w:w="2160"/>
-        <w:gridCol w:w="2160"/>
-        <w:gridCol w:w="2160"/>
+        <w:gridCol w:w="2077"/>
+        <w:gridCol w:w="2077"/>
+        <w:gridCol w:w="2077"/>
+        <w:gridCol w:w="2077"/>
       </w:tblGrid>
       <w:tr>
         <w:tc>
           <w:tcPr>
-            <w:tcW w:type="dxa" w:w="2160"/>
+            <w:tcW w:type="dxa" w:w="2077"/>
           </w:tcPr>
           <w:p>
             <w:r>
@@ -500,7 +786,7 @@
         </w:tc>
         <w:tc>
           <w:tcPr>
-            <w:tcW w:type="dxa" w:w="2160"/>
+            <w:tcW w:type="dxa" w:w="2077"/>
           </w:tcPr>
           <w:p>
             <w:r>
@@ -513,7 +799,7 @@
         </w:tc>
         <w:tc>
           <w:tcPr>
-            <w:tcW w:type="dxa" w:w="2160"/>
+            <w:tcW w:type="dxa" w:w="2077"/>
           </w:tcPr>
           <w:p>
             <w:r>
@@ -526,7 +812,7 @@
         </w:tc>
         <w:tc>
           <w:tcPr>
-            <w:tcW w:type="dxa" w:w="2160"/>
+            <w:tcW w:type="dxa" w:w="2077"/>
           </w:tcPr>
           <w:p>
             <w:r>
@@ -541,7 +827,7 @@
       <w:tr>
         <w:tc>
           <w:tcPr>
-            <w:tcW w:type="dxa" w:w="2160"/>
+            <w:tcW w:type="dxa" w:w="2077"/>
           </w:tcPr>
           <w:p>
             <w:r>
@@ -551,7 +837,7 @@
         </w:tc>
         <w:tc>
           <w:tcPr>
-            <w:tcW w:type="dxa" w:w="2160"/>
+            <w:tcW w:type="dxa" w:w="2077"/>
           </w:tcPr>
           <w:p>
             <w:r>
@@ -561,7 +847,7 @@
         </w:tc>
         <w:tc>
           <w:tcPr>
-            <w:tcW w:type="dxa" w:w="2160"/>
+            <w:tcW w:type="dxa" w:w="2077"/>
           </w:tcPr>
           <w:p>
             <w:r>
@@ -571,7 +857,7 @@
         </w:tc>
         <w:tc>
           <w:tcPr>
-            <w:tcW w:type="dxa" w:w="2160"/>
+            <w:tcW w:type="dxa" w:w="2077"/>
           </w:tcPr>
           <w:p>
             <w:r>
@@ -583,7 +869,7 @@
       <w:tr>
         <w:tc>
           <w:tcPr>
-            <w:tcW w:type="dxa" w:w="2160"/>
+            <w:tcW w:type="dxa" w:w="2077"/>
           </w:tcPr>
           <w:p>
             <w:r>
@@ -593,7 +879,7 @@
         </w:tc>
         <w:tc>
           <w:tcPr>
-            <w:tcW w:type="dxa" w:w="2160"/>
+            <w:tcW w:type="dxa" w:w="2077"/>
           </w:tcPr>
           <w:p>
             <w:r>
@@ -603,7 +889,7 @@
         </w:tc>
         <w:tc>
           <w:tcPr>
-            <w:tcW w:type="dxa" w:w="2160"/>
+            <w:tcW w:type="dxa" w:w="2077"/>
           </w:tcPr>
           <w:p>
             <w:r>
@@ -613,7 +899,7 @@
         </w:tc>
         <w:tc>
           <w:tcPr>
-            <w:tcW w:type="dxa" w:w="2160"/>
+            <w:tcW w:type="dxa" w:w="2077"/>
           </w:tcPr>
           <w:p>
             <w:r>
@@ -625,7 +911,7 @@
       <w:tr>
         <w:tc>
           <w:tcPr>
-            <w:tcW w:type="dxa" w:w="2160"/>
+            <w:tcW w:type="dxa" w:w="2077"/>
           </w:tcPr>
           <w:p>
             <w:r>
@@ -635,7 +921,7 @@
         </w:tc>
         <w:tc>
           <w:tcPr>
-            <w:tcW w:type="dxa" w:w="2160"/>
+            <w:tcW w:type="dxa" w:w="2077"/>
           </w:tcPr>
           <w:p>
             <w:r>
@@ -645,7 +931,7 @@
         </w:tc>
         <w:tc>
           <w:tcPr>
-            <w:tcW w:type="dxa" w:w="2160"/>
+            <w:tcW w:type="dxa" w:w="2077"/>
           </w:tcPr>
           <w:p>
             <w:r>
@@ -655,7 +941,7 @@
         </w:tc>
         <w:tc>
           <w:tcPr>
-            <w:tcW w:type="dxa" w:w="2160"/>
+            <w:tcW w:type="dxa" w:w="2077"/>
           </w:tcPr>
           <w:p>
             <w:r>
@@ -674,7 +960,7 @@
         <w:drawing>
           <wp:inline xmlns:a="http://schemas.openxmlformats.org/drawingml/2006/main" xmlns:pic="http://schemas.openxmlformats.org/drawingml/2006/picture">
             <wp:extent cx="5943600" cy="1188720"/>
-            <wp:docPr id="4" name="Picture 4"/>
+            <wp:docPr id="5" name="Picture 5"/>
             <wp:cNvGraphicFramePr>
               <a:graphicFrameLocks noChangeAspect="1"/>
             </wp:cNvGraphicFramePr>
@@ -686,7 +972,7 @@
                     <pic:cNvPicPr/>
                   </pic:nvPicPr>
                   <pic:blipFill>
-                    <a:blip r:embed="rId13"/>
+                    <a:blip r:embed="rId14"/>
                     <a:stretch>
                       <a:fillRect/>
                     </a:stretch>
@@ -741,7 +1027,7 @@
         <w:drawing>
           <wp:inline xmlns:a="http://schemas.openxmlformats.org/drawingml/2006/main" xmlns:pic="http://schemas.openxmlformats.org/drawingml/2006/picture">
             <wp:extent cx="5669280" cy="3342736"/>
-            <wp:docPr id="5" name="Picture 5"/>
+            <wp:docPr id="6" name="Picture 6"/>
             <wp:cNvGraphicFramePr>
               <a:graphicFrameLocks noChangeAspect="1"/>
             </wp:cNvGraphicFramePr>
@@ -753,7 +1039,7 @@
                     <pic:cNvPicPr/>
                   </pic:nvPicPr>
                   <pic:blipFill>
-                    <a:blip r:embed="rId14"/>
+                    <a:blip r:embed="rId15"/>
                     <a:stretch>
                       <a:fillRect/>
                     </a:stretch>
@@ -791,7 +1077,7 @@
         <w:drawing>
           <wp:inline xmlns:a="http://schemas.openxmlformats.org/drawingml/2006/main" xmlns:pic="http://schemas.openxmlformats.org/drawingml/2006/picture">
             <wp:extent cx="5943600" cy="2834640"/>
-            <wp:docPr id="6" name="Picture 6"/>
+            <wp:docPr id="7" name="Picture 7"/>
             <wp:cNvGraphicFramePr>
               <a:graphicFrameLocks noChangeAspect="1"/>
             </wp:cNvGraphicFramePr>
@@ -803,7 +1089,7 @@
                     <pic:cNvPicPr/>
                   </pic:nvPicPr>
                   <pic:blipFill>
-                    <a:blip r:embed="rId15"/>
+                    <a:blip r:embed="rId16"/>
                     <a:stretch>
                       <a:fillRect/>
                     </a:stretch>
@@ -856,13 +1142,13 @@
         <w:tblLook w:firstColumn="1" w:firstRow="1" w:lastColumn="0" w:lastRow="0" w:noHBand="0" w:noVBand="1" w:val="04A0"/>
       </w:tblPr>
       <w:tblGrid>
-        <w:gridCol w:w="4320"/>
-        <w:gridCol w:w="4320"/>
+        <w:gridCol w:w="4154"/>
+        <w:gridCol w:w="4154"/>
       </w:tblGrid>
       <w:tr>
         <w:tc>
           <w:tcPr>
-            <w:tcW w:type="dxa" w:w="4320"/>
+            <w:tcW w:type="dxa" w:w="4154"/>
           </w:tcPr>
           <w:p>
             <w:r>
@@ -875,7 +1161,7 @@
         </w:tc>
         <w:tc>
           <w:tcPr>
-            <w:tcW w:type="dxa" w:w="4320"/>
+            <w:tcW w:type="dxa" w:w="4154"/>
           </w:tcPr>
           <w:p>
             <w:r>
@@ -890,7 +1176,7 @@
       <w:tr>
         <w:tc>
           <w:tcPr>
-            <w:tcW w:type="dxa" w:w="4320"/>
+            <w:tcW w:type="dxa" w:w="4154"/>
           </w:tcPr>
           <w:p>
             <w:r>
@@ -900,7 +1186,7 @@
         </w:tc>
         <w:tc>
           <w:tcPr>
-            <w:tcW w:type="dxa" w:w="4320"/>
+            <w:tcW w:type="dxa" w:w="4154"/>
           </w:tcPr>
           <w:p>
             <w:r>
@@ -912,7 +1198,7 @@
       <w:tr>
         <w:tc>
           <w:tcPr>
-            <w:tcW w:type="dxa" w:w="4320"/>
+            <w:tcW w:type="dxa" w:w="4154"/>
           </w:tcPr>
           <w:p>
             <w:r>
@@ -922,7 +1208,7 @@
         </w:tc>
         <w:tc>
           <w:tcPr>
-            <w:tcW w:type="dxa" w:w="4320"/>
+            <w:tcW w:type="dxa" w:w="4154"/>
           </w:tcPr>
           <w:p>
             <w:r>
@@ -934,7 +1220,7 @@
       <w:tr>
         <w:tc>
           <w:tcPr>
-            <w:tcW w:type="dxa" w:w="4320"/>
+            <w:tcW w:type="dxa" w:w="4154"/>
           </w:tcPr>
           <w:p>
             <w:r>
@@ -944,7 +1230,7 @@
         </w:tc>
         <w:tc>
           <w:tcPr>
-            <w:tcW w:type="dxa" w:w="4320"/>
+            <w:tcW w:type="dxa" w:w="4154"/>
           </w:tcPr>
           <w:p>
             <w:r>
@@ -956,7 +1242,7 @@
       <w:tr>
         <w:tc>
           <w:tcPr>
-            <w:tcW w:type="dxa" w:w="4320"/>
+            <w:tcW w:type="dxa" w:w="4154"/>
           </w:tcPr>
           <w:p>
             <w:r>
@@ -966,7 +1252,7 @@
         </w:tc>
         <w:tc>
           <w:tcPr>
-            <w:tcW w:type="dxa" w:w="4320"/>
+            <w:tcW w:type="dxa" w:w="4154"/>
           </w:tcPr>
           <w:p>
             <w:r>
@@ -993,14 +1279,14 @@
         <w:tblLook w:firstColumn="1" w:firstRow="1" w:lastColumn="0" w:lastRow="0" w:noHBand="0" w:noVBand="1" w:val="04A0"/>
       </w:tblPr>
       <w:tblGrid>
-        <w:gridCol w:w="2880"/>
-        <w:gridCol w:w="2880"/>
-        <w:gridCol w:w="2880"/>
+        <w:gridCol w:w="2770"/>
+        <w:gridCol w:w="2770"/>
+        <w:gridCol w:w="2770"/>
       </w:tblGrid>
       <w:tr>
         <w:tc>
           <w:tcPr>
-            <w:tcW w:type="dxa" w:w="2880"/>
+            <w:tcW w:type="dxa" w:w="2770"/>
           </w:tcPr>
           <w:p>
             <w:r>
@@ -1013,7 +1299,7 @@
         </w:tc>
         <w:tc>
           <w:tcPr>
-            <w:tcW w:type="dxa" w:w="2880"/>
+            <w:tcW w:type="dxa" w:w="2770"/>
           </w:tcPr>
           <w:p>
             <w:r>
@@ -1026,7 +1312,7 @@
         </w:tc>
         <w:tc>
           <w:tcPr>
-            <w:tcW w:type="dxa" w:w="2880"/>
+            <w:tcW w:type="dxa" w:w="2770"/>
           </w:tcPr>
           <w:p>
             <w:r>
@@ -1041,7 +1327,7 @@
       <w:tr>
         <w:tc>
           <w:tcPr>
-            <w:tcW w:type="dxa" w:w="2880"/>
+            <w:tcW w:type="dxa" w:w="2770"/>
           </w:tcPr>
           <w:p>
             <w:r>
@@ -1051,7 +1337,7 @@
         </w:tc>
         <w:tc>
           <w:tcPr>
-            <w:tcW w:type="dxa" w:w="2880"/>
+            <w:tcW w:type="dxa" w:w="2770"/>
           </w:tcPr>
           <w:p>
             <w:r>
@@ -1061,7 +1347,7 @@
         </w:tc>
         <w:tc>
           <w:tcPr>
-            <w:tcW w:type="dxa" w:w="2880"/>
+            <w:tcW w:type="dxa" w:w="2770"/>
           </w:tcPr>
           <w:p>
             <w:r>
@@ -1073,7 +1359,7 @@
       <w:tr>
         <w:tc>
           <w:tcPr>
-            <w:tcW w:type="dxa" w:w="2880"/>
+            <w:tcW w:type="dxa" w:w="2770"/>
           </w:tcPr>
           <w:p>
             <w:r>
@@ -1083,7 +1369,7 @@
         </w:tc>
         <w:tc>
           <w:tcPr>
-            <w:tcW w:type="dxa" w:w="2880"/>
+            <w:tcW w:type="dxa" w:w="2770"/>
           </w:tcPr>
           <w:p>
             <w:r>
@@ -1093,7 +1379,7 @@
         </w:tc>
         <w:tc>
           <w:tcPr>
-            <w:tcW w:type="dxa" w:w="2880"/>
+            <w:tcW w:type="dxa" w:w="2770"/>
           </w:tcPr>
           <w:p>
             <w:r>
@@ -1105,7 +1391,7 @@
       <w:tr>
         <w:tc>
           <w:tcPr>
-            <w:tcW w:type="dxa" w:w="2880"/>
+            <w:tcW w:type="dxa" w:w="2770"/>
           </w:tcPr>
           <w:p>
             <w:r>
@@ -1115,7 +1401,7 @@
         </w:tc>
         <w:tc>
           <w:tcPr>
-            <w:tcW w:type="dxa" w:w="2880"/>
+            <w:tcW w:type="dxa" w:w="2770"/>
           </w:tcPr>
           <w:p>
             <w:r>
@@ -1125,7 +1411,7 @@
         </w:tc>
         <w:tc>
           <w:tcPr>
-            <w:tcW w:type="dxa" w:w="2880"/>
+            <w:tcW w:type="dxa" w:w="2770"/>
           </w:tcPr>
           <w:p>
             <w:r>
@@ -1153,7 +1439,7 @@
         <w:drawing>
           <wp:inline xmlns:a="http://schemas.openxmlformats.org/drawingml/2006/main" xmlns:pic="http://schemas.openxmlformats.org/drawingml/2006/picture">
             <wp:extent cx="4754880" cy="4226560"/>
-            <wp:docPr id="7" name="Picture 7"/>
+            <wp:docPr id="8" name="Picture 8"/>
             <wp:cNvGraphicFramePr>
               <a:graphicFrameLocks noChangeAspect="1"/>
             </wp:cNvGraphicFramePr>
@@ -1165,7 +1451,7 @@
                     <pic:cNvPicPr/>
                   </pic:nvPicPr>
                   <pic:blipFill>
-                    <a:blip r:embed="rId16"/>
+                    <a:blip r:embed="rId17"/>
                     <a:stretch>
                       <a:fillRect/>
                     </a:stretch>
@@ -1203,7 +1489,7 @@
         <w:drawing>
           <wp:inline xmlns:a="http://schemas.openxmlformats.org/drawingml/2006/main" xmlns:pic="http://schemas.openxmlformats.org/drawingml/2006/picture">
             <wp:extent cx="5760720" cy="1920240"/>
-            <wp:docPr id="8" name="Picture 8"/>
+            <wp:docPr id="9" name="Picture 9"/>
             <wp:cNvGraphicFramePr>
               <a:graphicFrameLocks noChangeAspect="1"/>
             </wp:cNvGraphicFramePr>
@@ -1215,7 +1501,7 @@
                     <pic:cNvPicPr/>
                   </pic:nvPicPr>
                   <pic:blipFill>
-                    <a:blip r:embed="rId17"/>
+                    <a:blip r:embed="rId18"/>
                     <a:stretch>
                       <a:fillRect/>
                     </a:stretch>
@@ -1278,13 +1564,13 @@
         <w:tblLook w:firstColumn="1" w:firstRow="1" w:lastColumn="0" w:lastRow="0" w:noHBand="0" w:noVBand="1" w:val="04A0"/>
       </w:tblPr>
       <w:tblGrid>
-        <w:gridCol w:w="4320"/>
-        <w:gridCol w:w="4320"/>
+        <w:gridCol w:w="4154"/>
+        <w:gridCol w:w="4154"/>
       </w:tblGrid>
       <w:tr>
         <w:tc>
           <w:tcPr>
-            <w:tcW w:type="dxa" w:w="4320"/>
+            <w:tcW w:type="dxa" w:w="4154"/>
           </w:tcPr>
           <w:p>
             <w:r>
@@ -1297,7 +1583,7 @@
         </w:tc>
         <w:tc>
           <w:tcPr>
-            <w:tcW w:type="dxa" w:w="4320"/>
+            <w:tcW w:type="dxa" w:w="4154"/>
           </w:tcPr>
           <w:p>
             <w:r>
@@ -1312,7 +1598,7 @@
       <w:tr>
         <w:tc>
           <w:tcPr>
-            <w:tcW w:type="dxa" w:w="4320"/>
+            <w:tcW w:type="dxa" w:w="4154"/>
           </w:tcPr>
           <w:p>
             <w:r>
@@ -1322,7 +1608,7 @@
         </w:tc>
         <w:tc>
           <w:tcPr>
-            <w:tcW w:type="dxa" w:w="4320"/>
+            <w:tcW w:type="dxa" w:w="4154"/>
           </w:tcPr>
           <w:p>
             <w:r>
@@ -1334,7 +1620,7 @@
       <w:tr>
         <w:tc>
           <w:tcPr>
-            <w:tcW w:type="dxa" w:w="4320"/>
+            <w:tcW w:type="dxa" w:w="4154"/>
           </w:tcPr>
           <w:p>
             <w:r>
@@ -1344,7 +1630,7 @@
         </w:tc>
         <w:tc>
           <w:tcPr>
-            <w:tcW w:type="dxa" w:w="4320"/>
+            <w:tcW w:type="dxa" w:w="4154"/>
           </w:tcPr>
           <w:p>
             <w:r>
@@ -1356,7 +1642,7 @@
       <w:tr>
         <w:tc>
           <w:tcPr>
-            <w:tcW w:type="dxa" w:w="4320"/>
+            <w:tcW w:type="dxa" w:w="4154"/>
           </w:tcPr>
           <w:p>
             <w:r>
@@ -1366,7 +1652,7 @@
         </w:tc>
         <w:tc>
           <w:tcPr>
-            <w:tcW w:type="dxa" w:w="4320"/>
+            <w:tcW w:type="dxa" w:w="4154"/>
           </w:tcPr>
           <w:p>
             <w:r>
@@ -1378,7 +1664,7 @@
       <w:tr>
         <w:tc>
           <w:tcPr>
-            <w:tcW w:type="dxa" w:w="4320"/>
+            <w:tcW w:type="dxa" w:w="4154"/>
           </w:tcPr>
           <w:p>
             <w:r>
@@ -1388,7 +1674,7 @@
         </w:tc>
         <w:tc>
           <w:tcPr>
-            <w:tcW w:type="dxa" w:w="4320"/>
+            <w:tcW w:type="dxa" w:w="4154"/>
           </w:tcPr>
           <w:p>
             <w:r>
@@ -1406,13 +1692,13 @@
         <w:tblLook w:firstColumn="1" w:firstRow="1" w:lastColumn="0" w:lastRow="0" w:noHBand="0" w:noVBand="1" w:val="04A0"/>
       </w:tblPr>
       <w:tblGrid>
-        <w:gridCol w:w="4320"/>
-        <w:gridCol w:w="4320"/>
+        <w:gridCol w:w="4154"/>
+        <w:gridCol w:w="4154"/>
       </w:tblGrid>
       <w:tr>
         <w:tc>
           <w:tcPr>
-            <w:tcW w:type="dxa" w:w="4320"/>
+            <w:tcW w:type="dxa" w:w="4154"/>
           </w:tcPr>
           <w:p>
             <w:r>
@@ -1425,7 +1711,7 @@
         </w:tc>
         <w:tc>
           <w:tcPr>
-            <w:tcW w:type="dxa" w:w="4320"/>
+            <w:tcW w:type="dxa" w:w="4154"/>
           </w:tcPr>
           <w:p>
             <w:r>
@@ -1440,7 +1726,7 @@
       <w:tr>
         <w:tc>
           <w:tcPr>
-            <w:tcW w:type="dxa" w:w="4320"/>
+            <w:tcW w:type="dxa" w:w="4154"/>
           </w:tcPr>
           <w:p>
             <w:r>
@@ -1450,7 +1736,7 @@
         </w:tc>
         <w:tc>
           <w:tcPr>
-            <w:tcW w:type="dxa" w:w="4320"/>
+            <w:tcW w:type="dxa" w:w="4154"/>
           </w:tcPr>
           <w:p>
             <w:r>
@@ -1462,7 +1748,7 @@
       <w:tr>
         <w:tc>
           <w:tcPr>
-            <w:tcW w:type="dxa" w:w="4320"/>
+            <w:tcW w:type="dxa" w:w="4154"/>
           </w:tcPr>
           <w:p>
             <w:r>
@@ -1472,7 +1758,7 @@
         </w:tc>
         <w:tc>
           <w:tcPr>
-            <w:tcW w:type="dxa" w:w="4320"/>
+            <w:tcW w:type="dxa" w:w="4154"/>
           </w:tcPr>
           <w:p>
             <w:r>
@@ -1484,7 +1770,7 @@
       <w:tr>
         <w:tc>
           <w:tcPr>
-            <w:tcW w:type="dxa" w:w="4320"/>
+            <w:tcW w:type="dxa" w:w="4154"/>
           </w:tcPr>
           <w:p>
             <w:r>
@@ -1494,7 +1780,7 @@
         </w:tc>
         <w:tc>
           <w:tcPr>
-            <w:tcW w:type="dxa" w:w="4320"/>
+            <w:tcW w:type="dxa" w:w="4154"/>
           </w:tcPr>
           <w:p>
             <w:r>
@@ -1513,7 +1799,7 @@
         <w:drawing>
           <wp:inline xmlns:a="http://schemas.openxmlformats.org/drawingml/2006/main" xmlns:pic="http://schemas.openxmlformats.org/drawingml/2006/picture">
             <wp:extent cx="5760720" cy="1843430"/>
-            <wp:docPr id="9" name="Picture 9"/>
+            <wp:docPr id="10" name="Picture 10"/>
             <wp:cNvGraphicFramePr>
               <a:graphicFrameLocks noChangeAspect="1"/>
             </wp:cNvGraphicFramePr>
@@ -1525,7 +1811,7 @@
                     <pic:cNvPicPr/>
                   </pic:nvPicPr>
                   <pic:blipFill>
-                    <a:blip r:embed="rId18"/>
+                    <a:blip r:embed="rId19"/>
                     <a:stretch>
                       <a:fillRect/>
                     </a:stretch>
@@ -1670,7 +1956,7 @@
       </w:r>
     </w:p>
     <w:sectPr>
-      <w:pgSz w:w="12240" w:h="15840"/>
+      <w:pgSz w:w="11909" w:h="16834"/>
       <w:pgMar w:top="1440" w:right="1800" w:bottom="1440" w:left="1800" w:header="720" w:footer="720" w:gutter="0"/>
       <w:cols w:space="720"/>
       <w:docGrid w:linePitch="360"/>

</xml_diff>

<commit_message>
formulas as images in report
</commit_message>
<xml_diff>
--- a/report/Project_Report.docx
+++ b/report/Project_Report.docx
@@ -394,7 +394,94 @@
           <w:b w:val="0"/>
           <w:i w:val="0"/>
         </w:rPr>
-        <w:t>A video frame is a function I : {0,…,H−1} × {0,…,W−1} → {0,…,255}³ (colour image, H×W pixels; 480×640 for the laptop camera). The frame contains n ≥ 0 handwritten characters written in dark ink on a light background. Training data: a labelled set D = {(g_i, y_i)}, where g_i ∈ [0,1]^{28×28} is a grey-scale character image and y_i ∈ A is its label.</w:t>
+        <w:t>A video frame is a colour image with H × W pixels (480 × 640 for the laptop camera), i.e. a function</w:t>
+      </w:r>
+    </w:p>
+    <w:p>
+      <w:pPr>
+        <w:jc w:val="center"/>
+      </w:pPr>
+      <w:r>
+        <w:drawing>
+          <wp:inline xmlns:a="http://schemas.openxmlformats.org/drawingml/2006/main" xmlns:pic="http://schemas.openxmlformats.org/drawingml/2006/picture">
+            <wp:extent cx="3529584" cy="318211"/>
+            <wp:docPr id="2" name="Picture 2"/>
+            <wp:cNvGraphicFramePr>
+              <a:graphicFrameLocks noChangeAspect="1"/>
+            </wp:cNvGraphicFramePr>
+            <a:graphic>
+              <a:graphicData uri="http://schemas.openxmlformats.org/drawingml/2006/picture">
+                <pic:pic>
+                  <pic:nvPicPr>
+                    <pic:cNvPr id="0" name="frame.png"/>
+                    <pic:cNvPicPr/>
+                  </pic:nvPicPr>
+                  <pic:blipFill>
+                    <a:blip r:embed="rId11"/>
+                    <a:stretch>
+                      <a:fillRect/>
+                    </a:stretch>
+                  </pic:blipFill>
+                  <pic:spPr>
+                    <a:xfrm>
+                      <a:off x="0" y="0"/>
+                      <a:ext cx="3529584" cy="318211"/>
+                    </a:xfrm>
+                    <a:prstGeom prst="rect"/>
+                  </pic:spPr>
+                </pic:pic>
+              </a:graphicData>
+            </a:graphic>
+          </wp:inline>
+        </w:drawing>
+      </w:r>
+    </w:p>
+    <w:p>
+      <w:r>
+        <w:rPr>
+          <w:b w:val="0"/>
+          <w:i w:val="0"/>
+        </w:rPr>
+        <w:t>The frame contains n ≥ 0 handwritten characters written in dark ink on a light background. For training we use a labelled set of N grey-scale character images g of size 28 × 28, each with a label y from the alphabet A:</w:t>
+      </w:r>
+    </w:p>
+    <w:p>
+      <w:pPr>
+        <w:jc w:val="center"/>
+      </w:pPr>
+      <w:r>
+        <w:drawing>
+          <wp:inline xmlns:a="http://schemas.openxmlformats.org/drawingml/2006/main" xmlns:pic="http://schemas.openxmlformats.org/drawingml/2006/picture">
+            <wp:extent cx="3999585" cy="329184"/>
+            <wp:docPr id="3" name="Picture 3"/>
+            <wp:cNvGraphicFramePr>
+              <a:graphicFrameLocks noChangeAspect="1"/>
+            </wp:cNvGraphicFramePr>
+            <a:graphic>
+              <a:graphicData uri="http://schemas.openxmlformats.org/drawingml/2006/picture">
+                <pic:pic>
+                  <pic:nvPicPr>
+                    <pic:cNvPr id="0" name="dataset.png"/>
+                    <pic:cNvPicPr/>
+                  </pic:nvPicPr>
+                  <pic:blipFill>
+                    <a:blip r:embed="rId12"/>
+                    <a:stretch>
+                      <a:fillRect/>
+                    </a:stretch>
+                  </pic:blipFill>
+                  <pic:spPr>
+                    <a:xfrm>
+                      <a:off x="0" y="0"/>
+                      <a:ext cx="3999585" cy="329184"/>
+                    </a:xfrm>
+                    <a:prstGeom prst="rect"/>
+                  </pic:spPr>
+                </pic:pic>
+              </a:graphicData>
+            </a:graphic>
+          </wp:inline>
+        </w:drawing>
       </w:r>
     </w:p>
     <w:p>
@@ -420,7 +507,55 @@
           <w:b w:val="0"/>
           <w:i w:val="0"/>
         </w:rPr>
-        <w:t>An ordered sequence of n pairs ((c₁, ρ₁), …, (c_n, ρ_n)) where c_k ∈ A is the recognised character at position k (reading order: left to right, top to bottom) and ρ_k ∈ [0,100] is its fuzzy reliability in percent. The text output is the string s = c₁c₂…c_n with a space inserted where the horizontal gap between two characters is more than 1.2 × the median character width.</w:t>
+        <w:t>An ordered sequence of n pairs, where c is the recognised character at position k (reading order: left to right, top to bottom) and ρ is its fuzzy reliability in percent:</w:t>
+      </w:r>
+    </w:p>
+    <w:p>
+      <w:pPr>
+        <w:jc w:val="center"/>
+      </w:pPr>
+      <w:r>
+        <w:drawing>
+          <wp:inline xmlns:a="http://schemas.openxmlformats.org/drawingml/2006/main" xmlns:pic="http://schemas.openxmlformats.org/drawingml/2006/picture">
+            <wp:extent cx="3950208" cy="285293"/>
+            <wp:docPr id="4" name="Picture 4"/>
+            <wp:cNvGraphicFramePr>
+              <a:graphicFrameLocks noChangeAspect="1"/>
+            </wp:cNvGraphicFramePr>
+            <a:graphic>
+              <a:graphicData uri="http://schemas.openxmlformats.org/drawingml/2006/picture">
+                <pic:pic>
+                  <pic:nvPicPr>
+                    <pic:cNvPr id="0" name="output.png"/>
+                    <pic:cNvPicPr/>
+                  </pic:nvPicPr>
+                  <pic:blipFill>
+                    <a:blip r:embed="rId13"/>
+                    <a:stretch>
+                      <a:fillRect/>
+                    </a:stretch>
+                  </pic:blipFill>
+                  <pic:spPr>
+                    <a:xfrm>
+                      <a:off x="0" y="0"/>
+                      <a:ext cx="3950208" cy="285293"/>
+                    </a:xfrm>
+                    <a:prstGeom prst="rect"/>
+                  </pic:spPr>
+                </pic:pic>
+              </a:graphicData>
+            </a:graphic>
+          </wp:inline>
+        </w:drawing>
+      </w:r>
+    </w:p>
+    <w:p>
+      <w:r>
+        <w:rPr>
+          <w:b w:val="0"/>
+          <w:i w:val="0"/>
+        </w:rPr>
+        <w:t>The text output is the recognised characters joined into one string, with a space inserted where the horizontal gap between two characters is more than 1.2 × the median character width.</w:t>
       </w:r>
     </w:p>
     <w:p>
@@ -437,7 +572,7 @@
           <w:b w:val="0"/>
           <w:i w:val="0"/>
         </w:rPr>
-        <w:t>Step 1 – Segmentation. The frame is converted to grey, blurred, and thresholded with a local (adaptive) threshold, giving a binary ink mask M(x,y) ∈ {0,1}. Each 8-connected component of M whose area and height are within limits is a character candidate with bounding box b_k. Each candidate is resized to fit a 20×20 box (aspect ratio kept) and centred in a 28×28 image g_k – the same format as the training data.</w:t>
+        <w:t>Step 1 – Segmentation. The frame is converted to grey, blurred, and thresholded with a local (adaptive) threshold, giving a binary ink mask. Each 8-connected component of the mask whose area and height are within limits is a character candidate with a bounding box. Each candidate is resized to fit a 20×20 box (aspect ratio kept) and centred in a 28×28 image g – the same format as the training data.</w:t>
       </w:r>
     </w:p>
     <w:p>
@@ -446,7 +581,46 @@
           <w:b w:val="0"/>
           <w:i w:val="0"/>
         </w:rPr>
-        <w:t>Step 2 – Feature vector. A feature map φ : [0,1]^{28×28} → [0,1]^{177} gives x = φ(g). The first 49 numbers are the average ink in each 4×4 block (ink-density zones); the other 128 are stroke-direction values: the image is cut into 4×4 cells and in each cell the gradient strength is added up in 8 orientation bins (0°–180°), then the whole vector is scaled to unit length.</w:t>
+        <w:t>Step 2 – Feature vector. A feature map φ turns the 28×28 image into 177 numbers. The first 49 are the average ink in each 4×4 block (ink-density zones); the other 128 are stroke-direction values: the image is cut into 4×4 cells and in each cell the gradient strength is added up in 8 orientation bins (0°–180°), then the whole vector is scaled to unit length.</w:t>
+      </w:r>
+    </w:p>
+    <w:p>
+      <w:pPr>
+        <w:jc w:val="center"/>
+      </w:pPr>
+      <w:r>
+        <w:drawing>
+          <wp:inline xmlns:a="http://schemas.openxmlformats.org/drawingml/2006/main" xmlns:pic="http://schemas.openxmlformats.org/drawingml/2006/picture">
+            <wp:extent cx="4233672" cy="305410"/>
+            <wp:docPr id="5" name="Picture 5"/>
+            <wp:cNvGraphicFramePr>
+              <a:graphicFrameLocks noChangeAspect="1"/>
+            </wp:cNvGraphicFramePr>
+            <a:graphic>
+              <a:graphicData uri="http://schemas.openxmlformats.org/drawingml/2006/picture">
+                <pic:pic>
+                  <pic:nvPicPr>
+                    <pic:cNvPr id="0" name="features.png"/>
+                    <pic:cNvPicPr/>
+                  </pic:nvPicPr>
+                  <pic:blipFill>
+                    <a:blip r:embed="rId14"/>
+                    <a:stretch>
+                      <a:fillRect/>
+                    </a:stretch>
+                  </pic:blipFill>
+                  <pic:spPr>
+                    <a:xfrm>
+                      <a:off x="0" y="0"/>
+                      <a:ext cx="4233672" cy="305410"/>
+                    </a:xfrm>
+                    <a:prstGeom prst="rect"/>
+                  </pic:spPr>
+                </pic:pic>
+              </a:graphicData>
+            </a:graphic>
+          </wp:inline>
+        </w:drawing>
       </w:r>
     </w:p>
     <w:p>
@@ -455,7 +629,7 @@
           <w:b w:val="0"/>
           <w:i w:val="0"/>
         </w:rPr>
-        <w:t>Step 3 – Fuzzy rule base. For every class k there are m = 4 fuzzy rules R_{k,r} (188 rules in total):</w:t>
+        <w:t>Step 3 – Fuzzy rule base. For every class k there are 4 fuzzy rules R(k, r) (188 rules in total):</w:t>
       </w:r>
     </w:p>
     <w:p>
@@ -463,11 +637,38 @@
         <w:jc w:val="center"/>
       </w:pPr>
       <w:r>
-        <w:rPr>
-          <w:rFonts w:ascii="Cambria Math" w:hAnsi="Cambria Math"/>
-          <w:i/>
-        </w:rPr>
-        <w:t>R_{k,r}:  IF x₁ is ~c₁ AND x₂ is ~c₂ AND … AND x₁₇₇ is ~c₁₇₇  THEN class = k</w:t>
+        <w:drawing>
+          <wp:inline xmlns:a="http://schemas.openxmlformats.org/drawingml/2006/main" xmlns:pic="http://schemas.openxmlformats.org/drawingml/2006/picture">
+            <wp:extent cx="5665622" cy="290779"/>
+            <wp:docPr id="6" name="Picture 6"/>
+            <wp:cNvGraphicFramePr>
+              <a:graphicFrameLocks noChangeAspect="1"/>
+            </wp:cNvGraphicFramePr>
+            <a:graphic>
+              <a:graphicData uri="http://schemas.openxmlformats.org/drawingml/2006/picture">
+                <pic:pic>
+                  <pic:nvPicPr>
+                    <pic:cNvPr id="0" name="rule.png"/>
+                    <pic:cNvPicPr/>
+                  </pic:nvPicPr>
+                  <pic:blipFill>
+                    <a:blip r:embed="rId15"/>
+                    <a:stretch>
+                      <a:fillRect/>
+                    </a:stretch>
+                  </pic:blipFill>
+                  <pic:spPr>
+                    <a:xfrm>
+                      <a:off x="0" y="0"/>
+                      <a:ext cx="5665622" cy="290779"/>
+                    </a:xfrm>
+                    <a:prstGeom prst="rect"/>
+                  </pic:spPr>
+                </pic:pic>
+              </a:graphicData>
+            </a:graphic>
+          </wp:inline>
+        </w:drawing>
       </w:r>
     </w:p>
     <w:p>
@@ -476,7 +677,7 @@
           <w:b w:val="0"/>
           <w:i w:val="0"/>
         </w:rPr>
-        <w:t>Each antecedent “x_j is ~c_j” is a Gaussian membership function μ_j(x_j) = exp(−(x_j − c_j)² / (2σ_j²)). The centres c and widths σ of the rules come from fuzzy c-means clustering (Section 3.2). AND is implemented as the geometric mean of the memberships, so the firing strength of a rule is</w:t>
+        <w:t>Each antecedent “x is ~c” is a Gaussian membership function, where c is the typical value of that feature and σ says how much it varies (every rule has its own c and σ for each of the 177 features):</w:t>
       </w:r>
     </w:p>
     <w:p>
@@ -484,11 +685,38 @@
         <w:jc w:val="center"/>
       </w:pPr>
       <w:r>
-        <w:rPr>
-          <w:rFonts w:ascii="Cambria Math" w:hAnsi="Cambria Math"/>
-          <w:i/>
-        </w:rPr>
-        <w:t>f_{k,r}(x) = ( Π_j μ_j(x_j) )^{1/177} = exp( −(1/177) Σ_j (x_j − c_j)² / (2σ_j²) )</w:t>
+        <w:drawing>
+          <wp:inline xmlns:a="http://schemas.openxmlformats.org/drawingml/2006/main" xmlns:pic="http://schemas.openxmlformats.org/drawingml/2006/picture">
+            <wp:extent cx="1944014" cy="579729"/>
+            <wp:docPr id="7" name="Picture 7"/>
+            <wp:cNvGraphicFramePr>
+              <a:graphicFrameLocks noChangeAspect="1"/>
+            </wp:cNvGraphicFramePr>
+            <a:graphic>
+              <a:graphicData uri="http://schemas.openxmlformats.org/drawingml/2006/picture">
+                <pic:pic>
+                  <pic:nvPicPr>
+                    <pic:cNvPr id="0" name="gauss.png"/>
+                    <pic:cNvPicPr/>
+                  </pic:nvPicPr>
+                  <pic:blipFill>
+                    <a:blip r:embed="rId16"/>
+                    <a:stretch>
+                      <a:fillRect/>
+                    </a:stretch>
+                  </pic:blipFill>
+                  <pic:spPr>
+                    <a:xfrm>
+                      <a:off x="0" y="0"/>
+                      <a:ext cx="1944014" cy="579729"/>
+                    </a:xfrm>
+                    <a:prstGeom prst="rect"/>
+                  </pic:spPr>
+                </pic:pic>
+              </a:graphicData>
+            </a:graphic>
+          </wp:inline>
+        </w:drawing>
       </w:r>
     </w:p>
     <w:p>
@@ -497,7 +725,46 @@
           <w:b w:val="0"/>
           <w:i w:val="0"/>
         </w:rPr>
-        <w:t>Rules of the same class are combined with OR = max, and the class membership is μ_k(x) = max_r f_{k,r}(x). Defuzzification (maximum-membership): ĉ = argmax_k μ_k(x). Strength s = μ_ĉ(x); gap γ = μ_ĉ(x) − (second largest μ_k(x)).</w:t>
+        <w:t>The centres c and widths σ of the rules come from fuzzy c-means clustering (Section 3.2). AND is implemented as the geometric mean of the memberships, so the firing strength of a rule is</w:t>
+      </w:r>
+    </w:p>
+    <w:p>
+      <w:pPr>
+        <w:jc w:val="center"/>
+      </w:pPr>
+      <w:r>
+        <w:drawing>
+          <wp:inline xmlns:a="http://schemas.openxmlformats.org/drawingml/2006/main" xmlns:pic="http://schemas.openxmlformats.org/drawingml/2006/picture">
+            <wp:extent cx="3776472" cy="629107"/>
+            <wp:docPr id="8" name="Picture 8"/>
+            <wp:cNvGraphicFramePr>
+              <a:graphicFrameLocks noChangeAspect="1"/>
+            </wp:cNvGraphicFramePr>
+            <a:graphic>
+              <a:graphicData uri="http://schemas.openxmlformats.org/drawingml/2006/picture">
+                <pic:pic>
+                  <pic:nvPicPr>
+                    <pic:cNvPr id="0" name="firing.png"/>
+                    <pic:cNvPicPr/>
+                  </pic:nvPicPr>
+                  <pic:blipFill>
+                    <a:blip r:embed="rId17"/>
+                    <a:stretch>
+                      <a:fillRect/>
+                    </a:stretch>
+                  </pic:blipFill>
+                  <pic:spPr>
+                    <a:xfrm>
+                      <a:off x="0" y="0"/>
+                      <a:ext cx="3776472" cy="629107"/>
+                    </a:xfrm>
+                    <a:prstGeom prst="rect"/>
+                  </pic:spPr>
+                </pic:pic>
+              </a:graphicData>
+            </a:graphic>
+          </wp:inline>
+        </w:drawing>
       </w:r>
     </w:p>
     <w:p>
@@ -506,7 +773,142 @@
           <w:b w:val="0"/>
           <w:i w:val="0"/>
         </w:rPr>
-        <w:t>Step 4 – Reliability controller (Mamdani). Inputs s ∈ [0,1] and γ ∈ [0,1] are fuzzified with triangular sets (Figure 4), nine IF-THEN rules (e.g. IF strength is HIGH AND gap is LARGE THEN reliability is HIGH) are evaluated with AND = min, clipped outputs are joined with max, and the centroid of the result gives ρ ∈ [0,100].</w:t>
+        <w:t>Rules of the same class are combined with OR = max, giving the membership of the character in class k. Defuzzification is by maximum membership: the class with the largest membership is the answer ĉ.</w:t>
+      </w:r>
+    </w:p>
+    <w:p>
+      <w:pPr>
+        <w:jc w:val="center"/>
+      </w:pPr>
+      <w:r>
+        <w:drawing>
+          <wp:inline xmlns:a="http://schemas.openxmlformats.org/drawingml/2006/main" xmlns:pic="http://schemas.openxmlformats.org/drawingml/2006/picture">
+            <wp:extent cx="3101644" cy="325526"/>
+            <wp:docPr id="9" name="Picture 9"/>
+            <wp:cNvGraphicFramePr>
+              <a:graphicFrameLocks noChangeAspect="1"/>
+            </wp:cNvGraphicFramePr>
+            <a:graphic>
+              <a:graphicData uri="http://schemas.openxmlformats.org/drawingml/2006/picture">
+                <pic:pic>
+                  <pic:nvPicPr>
+                    <pic:cNvPr id="0" name="classmem.png"/>
+                    <pic:cNvPicPr/>
+                  </pic:nvPicPr>
+                  <pic:blipFill>
+                    <a:blip r:embed="rId18"/>
+                    <a:stretch>
+                      <a:fillRect/>
+                    </a:stretch>
+                  </pic:blipFill>
+                  <pic:spPr>
+                    <a:xfrm>
+                      <a:off x="0" y="0"/>
+                      <a:ext cx="3101644" cy="325526"/>
+                    </a:xfrm>
+                    <a:prstGeom prst="rect"/>
+                  </pic:spPr>
+                </pic:pic>
+              </a:graphicData>
+            </a:graphic>
+          </wp:inline>
+        </w:drawing>
+      </w:r>
+    </w:p>
+    <w:p>
+      <w:r>
+        <w:rPr>
+          <w:b w:val="0"/>
+          <w:i w:val="0"/>
+        </w:rPr>
+        <w:t>The strength s is the winning membership, and the gap γ is how far it is ahead of the runner-up:</w:t>
+      </w:r>
+    </w:p>
+    <w:p>
+      <w:pPr>
+        <w:jc w:val="center"/>
+      </w:pPr>
+      <w:r>
+        <w:drawing>
+          <wp:inline xmlns:a="http://schemas.openxmlformats.org/drawingml/2006/main" xmlns:pic="http://schemas.openxmlformats.org/drawingml/2006/picture">
+            <wp:extent cx="2516428" cy="285293"/>
+            <wp:docPr id="10" name="Picture 10"/>
+            <wp:cNvGraphicFramePr>
+              <a:graphicFrameLocks noChangeAspect="1"/>
+            </wp:cNvGraphicFramePr>
+            <a:graphic>
+              <a:graphicData uri="http://schemas.openxmlformats.org/drawingml/2006/picture">
+                <pic:pic>
+                  <pic:nvPicPr>
+                    <pic:cNvPr id="0" name="strength.png"/>
+                    <pic:cNvPicPr/>
+                  </pic:nvPicPr>
+                  <pic:blipFill>
+                    <a:blip r:embed="rId19"/>
+                    <a:stretch>
+                      <a:fillRect/>
+                    </a:stretch>
+                  </pic:blipFill>
+                  <pic:spPr>
+                    <a:xfrm>
+                      <a:off x="0" y="0"/>
+                      <a:ext cx="2516428" cy="285293"/>
+                    </a:xfrm>
+                    <a:prstGeom prst="rect"/>
+                  </pic:spPr>
+                </pic:pic>
+              </a:graphicData>
+            </a:graphic>
+          </wp:inline>
+        </w:drawing>
+      </w:r>
+    </w:p>
+    <w:p>
+      <w:r>
+        <w:rPr>
+          <w:b w:val="0"/>
+          <w:i w:val="0"/>
+        </w:rPr>
+        <w:t>Step 4 – Reliability controller (Mamdani). Inputs s and γ (both in [0,1]) are fuzzified with triangular sets (Figure 4), nine IF-THEN rules (e.g. IF strength is HIGH AND gap is LARGE THEN reliability is HIGH) are evaluated with AND = min, clipped outputs are joined with max, and the centroid of the aggregated output set gives the reliability ρ between 0 and 100:</w:t>
+      </w:r>
+    </w:p>
+    <w:p>
+      <w:pPr>
+        <w:jc w:val="center"/>
+      </w:pPr>
+      <w:r>
+        <w:drawing>
+          <wp:inline xmlns:a="http://schemas.openxmlformats.org/drawingml/2006/main" xmlns:pic="http://schemas.openxmlformats.org/drawingml/2006/picture">
+            <wp:extent cx="1225296" cy="877824"/>
+            <wp:docPr id="11" name="Picture 11"/>
+            <wp:cNvGraphicFramePr>
+              <a:graphicFrameLocks noChangeAspect="1"/>
+            </wp:cNvGraphicFramePr>
+            <a:graphic>
+              <a:graphicData uri="http://schemas.openxmlformats.org/drawingml/2006/picture">
+                <pic:pic>
+                  <pic:nvPicPr>
+                    <pic:cNvPr id="0" name="centroid.png"/>
+                    <pic:cNvPicPr/>
+                  </pic:nvPicPr>
+                  <pic:blipFill>
+                    <a:blip r:embed="rId20"/>
+                    <a:stretch>
+                      <a:fillRect/>
+                    </a:stretch>
+                  </pic:blipFill>
+                  <pic:spPr>
+                    <a:xfrm>
+                      <a:off x="0" y="0"/>
+                      <a:ext cx="1225296" cy="877824"/>
+                    </a:xfrm>
+                    <a:prstGeom prst="rect"/>
+                  </pic:spPr>
+                </pic:pic>
+              </a:graphicData>
+            </a:graphic>
+          </wp:inline>
+        </w:drawing>
       </w:r>
     </w:p>
     <w:p>
@@ -523,7 +925,55 @@
           <w:b w:val="0"/>
           <w:i w:val="0"/>
         </w:rPr>
-        <w:t>Find the rule parameters that maximise top-1 accuracy Acc = (1/N) Σ [ĉ(x_i) = y_i] on a held-out test set, and make ρ meaningful: samples with higher ρ should be recognised correctly more often. Secondary measure: top-3 accuracy (true class among the three largest μ_k).</w:t>
+        <w:t>Find the rule parameters that maximise the top-1 accuracy on a held-out test set,</w:t>
+      </w:r>
+    </w:p>
+    <w:p>
+      <w:pPr>
+        <w:jc w:val="center"/>
+      </w:pPr>
+      <w:r>
+        <w:drawing>
+          <wp:inline xmlns:a="http://schemas.openxmlformats.org/drawingml/2006/main" xmlns:pic="http://schemas.openxmlformats.org/drawingml/2006/picture">
+            <wp:extent cx="1720900" cy="548640"/>
+            <wp:docPr id="12" name="Picture 12"/>
+            <wp:cNvGraphicFramePr>
+              <a:graphicFrameLocks noChangeAspect="1"/>
+            </wp:cNvGraphicFramePr>
+            <a:graphic>
+              <a:graphicData uri="http://schemas.openxmlformats.org/drawingml/2006/picture">
+                <pic:pic>
+                  <pic:nvPicPr>
+                    <pic:cNvPr id="0" name="accuracy.png"/>
+                    <pic:cNvPicPr/>
+                  </pic:nvPicPr>
+                  <pic:blipFill>
+                    <a:blip r:embed="rId21"/>
+                    <a:stretch>
+                      <a:fillRect/>
+                    </a:stretch>
+                  </pic:blipFill>
+                  <pic:spPr>
+                    <a:xfrm>
+                      <a:off x="0" y="0"/>
+                      <a:ext cx="1720900" cy="548640"/>
+                    </a:xfrm>
+                    <a:prstGeom prst="rect"/>
+                  </pic:spPr>
+                </pic:pic>
+              </a:graphicData>
+            </a:graphic>
+          </wp:inline>
+        </w:drawing>
+      </w:r>
+    </w:p>
+    <w:p>
+      <w:r>
+        <w:rPr>
+          <w:b w:val="0"/>
+          <w:i w:val="0"/>
+        </w:rPr>
+        <w:t>and make ρ meaningful: samples with higher ρ should be recognised correctly more often. Secondary measure: top-3 accuracy (true class among the three largest class memberships).</w:t>
       </w:r>
     </w:p>
     <w:p>
@@ -574,7 +1024,7 @@
         <w:drawing>
           <wp:inline xmlns:a="http://schemas.openxmlformats.org/drawingml/2006/main" xmlns:pic="http://schemas.openxmlformats.org/drawingml/2006/picture">
             <wp:extent cx="5943600" cy="1004377"/>
-            <wp:docPr id="2" name="Picture 2"/>
+            <wp:docPr id="13" name="Picture 13"/>
             <wp:cNvGraphicFramePr>
               <a:graphicFrameLocks noChangeAspect="1"/>
             </wp:cNvGraphicFramePr>
@@ -586,7 +1036,7 @@
                     <pic:cNvPicPr/>
                   </pic:nvPicPr>
                   <pic:blipFill>
-                    <a:blip r:embed="rId11"/>
+                    <a:blip r:embed="rId22"/>
                     <a:stretch>
                       <a:fillRect/>
                     </a:stretch>
@@ -641,7 +1091,7 @@
         <w:drawing>
           <wp:inline xmlns:a="http://schemas.openxmlformats.org/drawingml/2006/main" xmlns:pic="http://schemas.openxmlformats.org/drawingml/2006/picture">
             <wp:extent cx="5120640" cy="2662733"/>
-            <wp:docPr id="3" name="Picture 3"/>
+            <wp:docPr id="14" name="Picture 14"/>
             <wp:cNvGraphicFramePr>
               <a:graphicFrameLocks noChangeAspect="1"/>
             </wp:cNvGraphicFramePr>
@@ -653,7 +1103,7 @@
                     <pic:cNvPicPr/>
                   </pic:nvPicPr>
                   <pic:blipFill>
-                    <a:blip r:embed="rId12"/>
+                    <a:blip r:embed="rId23"/>
                     <a:stretch>
                       <a:fillRect/>
                     </a:stretch>
@@ -697,7 +1147,94 @@
           <w:b w:val="0"/>
           <w:i w:val="0"/>
         </w:rPr>
-        <w:t>For each class, its training feature vectors are clustered by fuzzy c-means (FCM, fuzzifier 2, 4 clusters). Unlike k-means, every sample belongs to every cluster with a degree u_{ik} ∈ [0,1], Σ_k u_{ik} = 1. FCM repeats two steps: (a) c_k = Σ u_{ik}² x_i / Σ u_{ik}²; (b) u_{ik} = 1 / Σ_l (d_{ik}/d_{il})². Each cluster becomes one rule: its centre gives c_j and the membership-weighted standard deviation gives σ_j. A floor of 0.3 × the overall standard deviation of feature j is applied, so a rule is never unrealistically narrow. The idea behind several rules per class is that one letter has several writing styles (e.g. 4 vs. open-top 4, 7 with or without a bar). Section 4.2 measures how much this actually helps.</w:t>
+        <w:t>For each class, its training feature vectors are clustered by fuzzy c-means (FCM, fuzzifier 2, 4 clusters). Unlike k-means, every sample belongs to every cluster with a degree u between 0 and 1, and the degrees of one sample add up to 1. FCM repeats two steps until it settles: (a) each cluster centre is the average of the samples weighted by u², (b) each membership u is recomputed from the distances d of the sample to the cluster centres.</w:t>
+      </w:r>
+    </w:p>
+    <w:p>
+      <w:pPr>
+        <w:jc w:val="center"/>
+      </w:pPr>
+      <w:r>
+        <w:drawing>
+          <wp:inline xmlns:a="http://schemas.openxmlformats.org/drawingml/2006/main" xmlns:pic="http://schemas.openxmlformats.org/drawingml/2006/picture">
+            <wp:extent cx="1009497" cy="826617"/>
+            <wp:docPr id="15" name="Picture 15"/>
+            <wp:cNvGraphicFramePr>
+              <a:graphicFrameLocks noChangeAspect="1"/>
+            </wp:cNvGraphicFramePr>
+            <a:graphic>
+              <a:graphicData uri="http://schemas.openxmlformats.org/drawingml/2006/picture">
+                <pic:pic>
+                  <pic:nvPicPr>
+                    <pic:cNvPr id="0" name="fcm_c.png"/>
+                    <pic:cNvPicPr/>
+                  </pic:nvPicPr>
+                  <pic:blipFill>
+                    <a:blip r:embed="rId24"/>
+                    <a:stretch>
+                      <a:fillRect/>
+                    </a:stretch>
+                  </pic:blipFill>
+                  <pic:spPr>
+                    <a:xfrm>
+                      <a:off x="0" y="0"/>
+                      <a:ext cx="1009497" cy="826617"/>
+                    </a:xfrm>
+                    <a:prstGeom prst="rect"/>
+                  </pic:spPr>
+                </pic:pic>
+              </a:graphicData>
+            </a:graphic>
+          </wp:inline>
+        </w:drawing>
+      </w:r>
+    </w:p>
+    <w:p>
+      <w:pPr>
+        <w:jc w:val="center"/>
+      </w:pPr>
+      <w:r>
+        <w:drawing>
+          <wp:inline xmlns:a="http://schemas.openxmlformats.org/drawingml/2006/main" xmlns:pic="http://schemas.openxmlformats.org/drawingml/2006/picture">
+            <wp:extent cx="2220163" cy="731520"/>
+            <wp:docPr id="16" name="Picture 16"/>
+            <wp:cNvGraphicFramePr>
+              <a:graphicFrameLocks noChangeAspect="1"/>
+            </wp:cNvGraphicFramePr>
+            <a:graphic>
+              <a:graphicData uri="http://schemas.openxmlformats.org/drawingml/2006/picture">
+                <pic:pic>
+                  <pic:nvPicPr>
+                    <pic:cNvPr id="0" name="fcm_u.png"/>
+                    <pic:cNvPicPr/>
+                  </pic:nvPicPr>
+                  <pic:blipFill>
+                    <a:blip r:embed="rId25"/>
+                    <a:stretch>
+                      <a:fillRect/>
+                    </a:stretch>
+                  </pic:blipFill>
+                  <pic:spPr>
+                    <a:xfrm>
+                      <a:off x="0" y="0"/>
+                      <a:ext cx="2220163" cy="731520"/>
+                    </a:xfrm>
+                    <a:prstGeom prst="rect"/>
+                  </pic:spPr>
+                </pic:pic>
+              </a:graphicData>
+            </a:graphic>
+          </wp:inline>
+        </w:drawing>
+      </w:r>
+    </w:p>
+    <w:p>
+      <w:r>
+        <w:rPr>
+          <w:b w:val="0"/>
+          <w:i w:val="0"/>
+        </w:rPr>
+        <w:t>Each cluster becomes one rule: its centre gives c and the membership-weighted standard deviation gives σ. A floor of 0.3 × the overall standard deviation of that feature is applied, so a rule is never unrealistically narrow. The idea behind several rules per class is that one letter has several writing styles (e.g. 4 vs. open-top 4, 7 with or without a bar). Section 4.2 measures how much this actually helps.</w:t>
       </w:r>
     </w:p>
     <w:p>
@@ -708,7 +1245,7 @@
         <w:drawing>
           <wp:inline xmlns:a="http://schemas.openxmlformats.org/drawingml/2006/main" xmlns:pic="http://schemas.openxmlformats.org/drawingml/2006/picture">
             <wp:extent cx="4572000" cy="1371600"/>
-            <wp:docPr id="4" name="Picture 4"/>
+            <wp:docPr id="17" name="Picture 17"/>
             <wp:cNvGraphicFramePr>
               <a:graphicFrameLocks noChangeAspect="1"/>
             </wp:cNvGraphicFramePr>
@@ -720,7 +1257,7 @@
                     <pic:cNvPicPr/>
                   </pic:nvPicPr>
                   <pic:blipFill>
-                    <a:blip r:embed="rId13"/>
+                    <a:blip r:embed="rId26"/>
                     <a:stretch>
                       <a:fillRect/>
                     </a:stretch>
@@ -960,7 +1497,7 @@
         <w:drawing>
           <wp:inline xmlns:a="http://schemas.openxmlformats.org/drawingml/2006/main" xmlns:pic="http://schemas.openxmlformats.org/drawingml/2006/picture">
             <wp:extent cx="5943600" cy="1188720"/>
-            <wp:docPr id="5" name="Picture 5"/>
+            <wp:docPr id="18" name="Picture 18"/>
             <wp:cNvGraphicFramePr>
               <a:graphicFrameLocks noChangeAspect="1"/>
             </wp:cNvGraphicFramePr>
@@ -972,7 +1509,7 @@
                     <pic:cNvPicPr/>
                   </pic:nvPicPr>
                   <pic:blipFill>
-                    <a:blip r:embed="rId14"/>
+                    <a:blip r:embed="rId27"/>
                     <a:stretch>
                       <a:fillRect/>
                     </a:stretch>
@@ -1027,7 +1564,7 @@
         <w:drawing>
           <wp:inline xmlns:a="http://schemas.openxmlformats.org/drawingml/2006/main" xmlns:pic="http://schemas.openxmlformats.org/drawingml/2006/picture">
             <wp:extent cx="5669280" cy="3342736"/>
-            <wp:docPr id="6" name="Picture 6"/>
+            <wp:docPr id="19" name="Picture 19"/>
             <wp:cNvGraphicFramePr>
               <a:graphicFrameLocks noChangeAspect="1"/>
             </wp:cNvGraphicFramePr>
@@ -1039,7 +1576,7 @@
                     <pic:cNvPicPr/>
                   </pic:nvPicPr>
                   <pic:blipFill>
-                    <a:blip r:embed="rId15"/>
+                    <a:blip r:embed="rId28"/>
                     <a:stretch>
                       <a:fillRect/>
                     </a:stretch>
@@ -1077,7 +1614,7 @@
         <w:drawing>
           <wp:inline xmlns:a="http://schemas.openxmlformats.org/drawingml/2006/main" xmlns:pic="http://schemas.openxmlformats.org/drawingml/2006/picture">
             <wp:extent cx="5943600" cy="2834640"/>
-            <wp:docPr id="7" name="Picture 7"/>
+            <wp:docPr id="20" name="Picture 20"/>
             <wp:cNvGraphicFramePr>
               <a:graphicFrameLocks noChangeAspect="1"/>
             </wp:cNvGraphicFramePr>
@@ -1089,7 +1626,7 @@
                     <pic:cNvPicPr/>
                   </pic:nvPicPr>
                   <pic:blipFill>
-                    <a:blip r:embed="rId16"/>
+                    <a:blip r:embed="rId29"/>
                     <a:stretch>
                       <a:fillRect/>
                     </a:stretch>
@@ -1439,7 +1976,7 @@
         <w:drawing>
           <wp:inline xmlns:a="http://schemas.openxmlformats.org/drawingml/2006/main" xmlns:pic="http://schemas.openxmlformats.org/drawingml/2006/picture">
             <wp:extent cx="4754880" cy="4226560"/>
-            <wp:docPr id="8" name="Picture 8"/>
+            <wp:docPr id="21" name="Picture 21"/>
             <wp:cNvGraphicFramePr>
               <a:graphicFrameLocks noChangeAspect="1"/>
             </wp:cNvGraphicFramePr>
@@ -1451,7 +1988,7 @@
                     <pic:cNvPicPr/>
                   </pic:nvPicPr>
                   <pic:blipFill>
-                    <a:blip r:embed="rId17"/>
+                    <a:blip r:embed="rId30"/>
                     <a:stretch>
                       <a:fillRect/>
                     </a:stretch>
@@ -1489,7 +2026,7 @@
         <w:drawing>
           <wp:inline xmlns:a="http://schemas.openxmlformats.org/drawingml/2006/main" xmlns:pic="http://schemas.openxmlformats.org/drawingml/2006/picture">
             <wp:extent cx="5760720" cy="1920240"/>
-            <wp:docPr id="9" name="Picture 9"/>
+            <wp:docPr id="22" name="Picture 22"/>
             <wp:cNvGraphicFramePr>
               <a:graphicFrameLocks noChangeAspect="1"/>
             </wp:cNvGraphicFramePr>
@@ -1501,7 +2038,7 @@
                     <pic:cNvPicPr/>
                   </pic:nvPicPr>
                   <pic:blipFill>
-                    <a:blip r:embed="rId18"/>
+                    <a:blip r:embed="rId31"/>
                     <a:stretch>
                       <a:fillRect/>
                     </a:stretch>
@@ -1799,7 +2336,7 @@
         <w:drawing>
           <wp:inline xmlns:a="http://schemas.openxmlformats.org/drawingml/2006/main" xmlns:pic="http://schemas.openxmlformats.org/drawingml/2006/picture">
             <wp:extent cx="5760720" cy="1843430"/>
-            <wp:docPr id="10" name="Picture 10"/>
+            <wp:docPr id="23" name="Picture 23"/>
             <wp:cNvGraphicFramePr>
               <a:graphicFrameLocks noChangeAspect="1"/>
             </wp:cNvGraphicFramePr>
@@ -1811,7 +2348,7 @@
                     <pic:cNvPicPr/>
                   </pic:nvPicPr>
                   <pic:blipFill>
-                    <a:blip r:embed="rId19"/>
+                    <a:blip r:embed="rId32"/>
                     <a:stretch>
                       <a:fillRect/>
                     </a:stretch>

</xml_diff>

<commit_message>
simpler formulas in report
</commit_message>
<xml_diff>
--- a/report/Project_Report.docx
+++ b/report/Project_Report.docx
@@ -394,46 +394,7 @@
           <w:b w:val="0"/>
           <w:i w:val="0"/>
         </w:rPr>
-        <w:t>A video frame is a colour image with H × W pixels (480 × 640 for the laptop camera), i.e. a function</w:t>
-      </w:r>
-    </w:p>
-    <w:p>
-      <w:pPr>
-        <w:jc w:val="center"/>
-      </w:pPr>
-      <w:r>
-        <w:drawing>
-          <wp:inline xmlns:a="http://schemas.openxmlformats.org/drawingml/2006/main" xmlns:pic="http://schemas.openxmlformats.org/drawingml/2006/picture">
-            <wp:extent cx="3529584" cy="318211"/>
-            <wp:docPr id="2" name="Picture 2"/>
-            <wp:cNvGraphicFramePr>
-              <a:graphicFrameLocks noChangeAspect="1"/>
-            </wp:cNvGraphicFramePr>
-            <a:graphic>
-              <a:graphicData uri="http://schemas.openxmlformats.org/drawingml/2006/picture">
-                <pic:pic>
-                  <pic:nvPicPr>
-                    <pic:cNvPr id="0" name="frame.png"/>
-                    <pic:cNvPicPr/>
-                  </pic:nvPicPr>
-                  <pic:blipFill>
-                    <a:blip r:embed="rId11"/>
-                    <a:stretch>
-                      <a:fillRect/>
-                    </a:stretch>
-                  </pic:blipFill>
-                  <pic:spPr>
-                    <a:xfrm>
-                      <a:off x="0" y="0"/>
-                      <a:ext cx="3529584" cy="318211"/>
-                    </a:xfrm>
-                    <a:prstGeom prst="rect"/>
-                  </pic:spPr>
-                </pic:pic>
-              </a:graphicData>
-            </a:graphic>
-          </wp:inline>
-        </w:drawing>
+        <w:t xml:space="preserve">A video frame is a colour image of H × W pixels (480 × 640 for the laptop camera), each pixel having a red, green and blue value from 0 to 255. </w:t>
       </w:r>
     </w:p>
     <w:p>
@@ -442,46 +403,7 @@
           <w:b w:val="0"/>
           <w:i w:val="0"/>
         </w:rPr>
-        <w:t>The frame contains n ≥ 0 handwritten characters written in dark ink on a light background. For training we use a labelled set of N grey-scale character images g of size 28 × 28, each with a label y from the alphabet A:</w:t>
-      </w:r>
-    </w:p>
-    <w:p>
-      <w:pPr>
-        <w:jc w:val="center"/>
-      </w:pPr>
-      <w:r>
-        <w:drawing>
-          <wp:inline xmlns:a="http://schemas.openxmlformats.org/drawingml/2006/main" xmlns:pic="http://schemas.openxmlformats.org/drawingml/2006/picture">
-            <wp:extent cx="3999585" cy="329184"/>
-            <wp:docPr id="3" name="Picture 3"/>
-            <wp:cNvGraphicFramePr>
-              <a:graphicFrameLocks noChangeAspect="1"/>
-            </wp:cNvGraphicFramePr>
-            <a:graphic>
-              <a:graphicData uri="http://schemas.openxmlformats.org/drawingml/2006/picture">
-                <pic:pic>
-                  <pic:nvPicPr>
-                    <pic:cNvPr id="0" name="dataset.png"/>
-                    <pic:cNvPicPr/>
-                  </pic:nvPicPr>
-                  <pic:blipFill>
-                    <a:blip r:embed="rId12"/>
-                    <a:stretch>
-                      <a:fillRect/>
-                    </a:stretch>
-                  </pic:blipFill>
-                  <pic:spPr>
-                    <a:xfrm>
-                      <a:off x="0" y="0"/>
-                      <a:ext cx="3999585" cy="329184"/>
-                    </a:xfrm>
-                    <a:prstGeom prst="rect"/>
-                  </pic:spPr>
-                </pic:pic>
-              </a:graphicData>
-            </a:graphic>
-          </wp:inline>
-        </w:drawing>
+        <w:t>The frame contains n ≥ 0 handwritten characters written in dark ink on a light background. For training we use a labelled set of N grey-scale character images g of size 28 × 28, each with a label y from the alphabet A.</w:t>
       </w:r>
     </w:p>
     <w:p>
@@ -517,8 +439,8 @@
       <w:r>
         <w:drawing>
           <wp:inline xmlns:a="http://schemas.openxmlformats.org/drawingml/2006/main" xmlns:pic="http://schemas.openxmlformats.org/drawingml/2006/picture">
-            <wp:extent cx="3950208" cy="285293"/>
-            <wp:docPr id="4" name="Picture 4"/>
+            <wp:extent cx="1863547" cy="270662"/>
+            <wp:docPr id="2" name="Picture 2"/>
             <wp:cNvGraphicFramePr>
               <a:graphicFrameLocks noChangeAspect="1"/>
             </wp:cNvGraphicFramePr>
@@ -530,7 +452,7 @@
                     <pic:cNvPicPr/>
                   </pic:nvPicPr>
                   <pic:blipFill>
-                    <a:blip r:embed="rId13"/>
+                    <a:blip r:embed="rId11"/>
                     <a:stretch>
                       <a:fillRect/>
                     </a:stretch>
@@ -538,7 +460,7 @@
                   <pic:spPr>
                     <a:xfrm>
                       <a:off x="0" y="0"/>
-                      <a:ext cx="3950208" cy="285293"/>
+                      <a:ext cx="1863547" cy="270662"/>
                     </a:xfrm>
                     <a:prstGeom prst="rect"/>
                   </pic:spPr>
@@ -581,46 +503,7 @@
           <w:b w:val="0"/>
           <w:i w:val="0"/>
         </w:rPr>
-        <w:t>Step 2 – Feature vector. A feature map φ turns the 28×28 image into 177 numbers. The first 49 are the average ink in each 4×4 block (ink-density zones); the other 128 are stroke-direction values: the image is cut into 4×4 cells and in each cell the gradient strength is added up in 8 orientation bins (0°–180°), then the whole vector is scaled to unit length.</w:t>
-      </w:r>
-    </w:p>
-    <w:p>
-      <w:pPr>
-        <w:jc w:val="center"/>
-      </w:pPr>
-      <w:r>
-        <w:drawing>
-          <wp:inline xmlns:a="http://schemas.openxmlformats.org/drawingml/2006/main" xmlns:pic="http://schemas.openxmlformats.org/drawingml/2006/picture">
-            <wp:extent cx="4233672" cy="305410"/>
-            <wp:docPr id="5" name="Picture 5"/>
-            <wp:cNvGraphicFramePr>
-              <a:graphicFrameLocks noChangeAspect="1"/>
-            </wp:cNvGraphicFramePr>
-            <a:graphic>
-              <a:graphicData uri="http://schemas.openxmlformats.org/drawingml/2006/picture">
-                <pic:pic>
-                  <pic:nvPicPr>
-                    <pic:cNvPr id="0" name="features.png"/>
-                    <pic:cNvPicPr/>
-                  </pic:nvPicPr>
-                  <pic:blipFill>
-                    <a:blip r:embed="rId14"/>
-                    <a:stretch>
-                      <a:fillRect/>
-                    </a:stretch>
-                  </pic:blipFill>
-                  <pic:spPr>
-                    <a:xfrm>
-                      <a:off x="0" y="0"/>
-                      <a:ext cx="4233672" cy="305410"/>
-                    </a:xfrm>
-                    <a:prstGeom prst="rect"/>
-                  </pic:spPr>
-                </pic:pic>
-              </a:graphicData>
-            </a:graphic>
-          </wp:inline>
-        </w:drawing>
+        <w:t>Step 2 – Feature vector. A feature map φ turns the 28×28 image into 177 numbers. The first 49 are the average ink in each 4×4 block (ink-density zones); the other 128 are stroke-direction values: the image is cut into 4×4 cells and in each cell the gradient strength is added up in 8 orientation bins (0°–180°), then the whole vector is scaled to unit length. Written as x = φ(g): 28×28 image in, 177 numbers out.</w:t>
       </w:r>
     </w:p>
     <w:p>
@@ -639,8 +522,8 @@
       <w:r>
         <w:drawing>
           <wp:inline xmlns:a="http://schemas.openxmlformats.org/drawingml/2006/main" xmlns:pic="http://schemas.openxmlformats.org/drawingml/2006/picture">
-            <wp:extent cx="5665622" cy="290779"/>
-            <wp:docPr id="6" name="Picture 6"/>
+            <wp:extent cx="3443630" cy="268834"/>
+            <wp:docPr id="3" name="Picture 3"/>
             <wp:cNvGraphicFramePr>
               <a:graphicFrameLocks noChangeAspect="1"/>
             </wp:cNvGraphicFramePr>
@@ -652,7 +535,7 @@
                     <pic:cNvPicPr/>
                   </pic:nvPicPr>
                   <pic:blipFill>
-                    <a:blip r:embed="rId15"/>
+                    <a:blip r:embed="rId12"/>
                     <a:stretch>
                       <a:fillRect/>
                     </a:stretch>
@@ -660,7 +543,7 @@
                   <pic:spPr>
                     <a:xfrm>
                       <a:off x="0" y="0"/>
-                      <a:ext cx="5665622" cy="290779"/>
+                      <a:ext cx="3443630" cy="268834"/>
                     </a:xfrm>
                     <a:prstGeom prst="rect"/>
                   </pic:spPr>
@@ -687,8 +570,8 @@
       <w:r>
         <w:drawing>
           <wp:inline xmlns:a="http://schemas.openxmlformats.org/drawingml/2006/main" xmlns:pic="http://schemas.openxmlformats.org/drawingml/2006/picture">
-            <wp:extent cx="1944014" cy="579729"/>
-            <wp:docPr id="7" name="Picture 7"/>
+            <wp:extent cx="1298448" cy="309067"/>
+            <wp:docPr id="4" name="Picture 4"/>
             <wp:cNvGraphicFramePr>
               <a:graphicFrameLocks noChangeAspect="1"/>
             </wp:cNvGraphicFramePr>
@@ -700,7 +583,7 @@
                     <pic:cNvPicPr/>
                   </pic:nvPicPr>
                   <pic:blipFill>
-                    <a:blip r:embed="rId16"/>
+                    <a:blip r:embed="rId13"/>
                     <a:stretch>
                       <a:fillRect/>
                     </a:stretch>
@@ -708,7 +591,7 @@
                   <pic:spPr>
                     <a:xfrm>
                       <a:off x="0" y="0"/>
-                      <a:ext cx="1944014" cy="579729"/>
+                      <a:ext cx="1298448" cy="309067"/>
                     </a:xfrm>
                     <a:prstGeom prst="rect"/>
                   </pic:spPr>
@@ -735,8 +618,8 @@
       <w:r>
         <w:drawing>
           <wp:inline xmlns:a="http://schemas.openxmlformats.org/drawingml/2006/main" xmlns:pic="http://schemas.openxmlformats.org/drawingml/2006/picture">
-            <wp:extent cx="3776472" cy="629107"/>
-            <wp:docPr id="8" name="Picture 8"/>
+            <wp:extent cx="1415491" cy="294436"/>
+            <wp:docPr id="5" name="Picture 5"/>
             <wp:cNvGraphicFramePr>
               <a:graphicFrameLocks noChangeAspect="1"/>
             </wp:cNvGraphicFramePr>
@@ -748,7 +631,7 @@
                     <pic:cNvPicPr/>
                   </pic:nvPicPr>
                   <pic:blipFill>
-                    <a:blip r:embed="rId17"/>
+                    <a:blip r:embed="rId14"/>
                     <a:stretch>
                       <a:fillRect/>
                     </a:stretch>
@@ -756,7 +639,7 @@
                   <pic:spPr>
                     <a:xfrm>
                       <a:off x="0" y="0"/>
-                      <a:ext cx="3776472" cy="629107"/>
+                      <a:ext cx="1415491" cy="294436"/>
                     </a:xfrm>
                     <a:prstGeom prst="rect"/>
                   </pic:spPr>
@@ -783,8 +666,8 @@
       <w:r>
         <w:drawing>
           <wp:inline xmlns:a="http://schemas.openxmlformats.org/drawingml/2006/main" xmlns:pic="http://schemas.openxmlformats.org/drawingml/2006/picture">
-            <wp:extent cx="3101644" cy="325526"/>
-            <wp:docPr id="9" name="Picture 9"/>
+            <wp:extent cx="2245766" cy="270662"/>
+            <wp:docPr id="6" name="Picture 6"/>
             <wp:cNvGraphicFramePr>
               <a:graphicFrameLocks noChangeAspect="1"/>
             </wp:cNvGraphicFramePr>
@@ -796,7 +679,7 @@
                     <pic:cNvPicPr/>
                   </pic:nvPicPr>
                   <pic:blipFill>
-                    <a:blip r:embed="rId18"/>
+                    <a:blip r:embed="rId15"/>
                     <a:stretch>
                       <a:fillRect/>
                     </a:stretch>
@@ -804,7 +687,7 @@
                   <pic:spPr>
                     <a:xfrm>
                       <a:off x="0" y="0"/>
-                      <a:ext cx="3101644" cy="325526"/>
+                      <a:ext cx="2245766" cy="270662"/>
                     </a:xfrm>
                     <a:prstGeom prst="rect"/>
                   </pic:spPr>
@@ -821,46 +704,7 @@
           <w:b w:val="0"/>
           <w:i w:val="0"/>
         </w:rPr>
-        <w:t>The strength s is the winning membership, and the gap γ is how far it is ahead of the runner-up:</w:t>
-      </w:r>
-    </w:p>
-    <w:p>
-      <w:pPr>
-        <w:jc w:val="center"/>
-      </w:pPr>
-      <w:r>
-        <w:drawing>
-          <wp:inline xmlns:a="http://schemas.openxmlformats.org/drawingml/2006/main" xmlns:pic="http://schemas.openxmlformats.org/drawingml/2006/picture">
-            <wp:extent cx="2516428" cy="285293"/>
-            <wp:docPr id="10" name="Picture 10"/>
-            <wp:cNvGraphicFramePr>
-              <a:graphicFrameLocks noChangeAspect="1"/>
-            </wp:cNvGraphicFramePr>
-            <a:graphic>
-              <a:graphicData uri="http://schemas.openxmlformats.org/drawingml/2006/picture">
-                <pic:pic>
-                  <pic:nvPicPr>
-                    <pic:cNvPr id="0" name="strength.png"/>
-                    <pic:cNvPicPr/>
-                  </pic:nvPicPr>
-                  <pic:blipFill>
-                    <a:blip r:embed="rId19"/>
-                    <a:stretch>
-                      <a:fillRect/>
-                    </a:stretch>
-                  </pic:blipFill>
-                  <pic:spPr>
-                    <a:xfrm>
-                      <a:off x="0" y="0"/>
-                      <a:ext cx="2516428" cy="285293"/>
-                    </a:xfrm>
-                    <a:prstGeom prst="rect"/>
-                  </pic:spPr>
-                </pic:pic>
-              </a:graphicData>
-            </a:graphic>
-          </wp:inline>
-        </w:drawing>
+        <w:t>The strength s is the winning membership, and the gap γ = s − (runner-up membership) shows how far ahead it is.</w:t>
       </w:r>
     </w:p>
     <w:p>
@@ -879,8 +723,8 @@
       <w:r>
         <w:drawing>
           <wp:inline xmlns:a="http://schemas.openxmlformats.org/drawingml/2006/main" xmlns:pic="http://schemas.openxmlformats.org/drawingml/2006/picture">
-            <wp:extent cx="1225296" cy="877824"/>
-            <wp:docPr id="11" name="Picture 11"/>
+            <wp:extent cx="996695" cy="577900"/>
+            <wp:docPr id="7" name="Picture 7"/>
             <wp:cNvGraphicFramePr>
               <a:graphicFrameLocks noChangeAspect="1"/>
             </wp:cNvGraphicFramePr>
@@ -892,7 +736,7 @@
                     <pic:cNvPicPr/>
                   </pic:nvPicPr>
                   <pic:blipFill>
-                    <a:blip r:embed="rId20"/>
+                    <a:blip r:embed="rId16"/>
                     <a:stretch>
                       <a:fillRect/>
                     </a:stretch>
@@ -900,7 +744,7 @@
                   <pic:spPr>
                     <a:xfrm>
                       <a:off x="0" y="0"/>
-                      <a:ext cx="1225296" cy="877824"/>
+                      <a:ext cx="996695" cy="577900"/>
                     </a:xfrm>
                     <a:prstGeom prst="rect"/>
                   </pic:spPr>
@@ -925,55 +769,7 @@
           <w:b w:val="0"/>
           <w:i w:val="0"/>
         </w:rPr>
-        <w:t>Find the rule parameters that maximise the top-1 accuracy on a held-out test set,</w:t>
-      </w:r>
-    </w:p>
-    <w:p>
-      <w:pPr>
-        <w:jc w:val="center"/>
-      </w:pPr>
-      <w:r>
-        <w:drawing>
-          <wp:inline xmlns:a="http://schemas.openxmlformats.org/drawingml/2006/main" xmlns:pic="http://schemas.openxmlformats.org/drawingml/2006/picture">
-            <wp:extent cx="1720900" cy="548640"/>
-            <wp:docPr id="12" name="Picture 12"/>
-            <wp:cNvGraphicFramePr>
-              <a:graphicFrameLocks noChangeAspect="1"/>
-            </wp:cNvGraphicFramePr>
-            <a:graphic>
-              <a:graphicData uri="http://schemas.openxmlformats.org/drawingml/2006/picture">
-                <pic:pic>
-                  <pic:nvPicPr>
-                    <pic:cNvPr id="0" name="accuracy.png"/>
-                    <pic:cNvPicPr/>
-                  </pic:nvPicPr>
-                  <pic:blipFill>
-                    <a:blip r:embed="rId21"/>
-                    <a:stretch>
-                      <a:fillRect/>
-                    </a:stretch>
-                  </pic:blipFill>
-                  <pic:spPr>
-                    <a:xfrm>
-                      <a:off x="0" y="0"/>
-                      <a:ext cx="1720900" cy="548640"/>
-                    </a:xfrm>
-                    <a:prstGeom prst="rect"/>
-                  </pic:spPr>
-                </pic:pic>
-              </a:graphicData>
-            </a:graphic>
-          </wp:inline>
-        </w:drawing>
-      </w:r>
-    </w:p>
-    <w:p>
-      <w:r>
-        <w:rPr>
-          <w:b w:val="0"/>
-          <w:i w:val="0"/>
-        </w:rPr>
-        <w:t>and make ρ meaningful: samples with higher ρ should be recognised correctly more often. Secondary measure: top-3 accuracy (true class among the three largest class memberships).</w:t>
+        <w:t>Find the rule parameters that maximise the top-1 accuracy (correct readings ÷ number of test images) on a held-out test set, and make ρ meaningful: samples with higher ρ should be recognised correctly more often. Secondary measure: top-3 accuracy (true class among the three largest class memberships).</w:t>
       </w:r>
     </w:p>
     <w:p>
@@ -1024,7 +820,7 @@
         <w:drawing>
           <wp:inline xmlns:a="http://schemas.openxmlformats.org/drawingml/2006/main" xmlns:pic="http://schemas.openxmlformats.org/drawingml/2006/picture">
             <wp:extent cx="5943600" cy="1004377"/>
-            <wp:docPr id="13" name="Picture 13"/>
+            <wp:docPr id="8" name="Picture 8"/>
             <wp:cNvGraphicFramePr>
               <a:graphicFrameLocks noChangeAspect="1"/>
             </wp:cNvGraphicFramePr>
@@ -1036,7 +832,7 @@
                     <pic:cNvPicPr/>
                   </pic:nvPicPr>
                   <pic:blipFill>
-                    <a:blip r:embed="rId22"/>
+                    <a:blip r:embed="rId17"/>
                     <a:stretch>
                       <a:fillRect/>
                     </a:stretch>
@@ -1091,7 +887,7 @@
         <w:drawing>
           <wp:inline xmlns:a="http://schemas.openxmlformats.org/drawingml/2006/main" xmlns:pic="http://schemas.openxmlformats.org/drawingml/2006/picture">
             <wp:extent cx="5120640" cy="2662733"/>
-            <wp:docPr id="14" name="Picture 14"/>
+            <wp:docPr id="9" name="Picture 9"/>
             <wp:cNvGraphicFramePr>
               <a:graphicFrameLocks noChangeAspect="1"/>
             </wp:cNvGraphicFramePr>
@@ -1103,7 +899,7 @@
                     <pic:cNvPicPr/>
                   </pic:nvPicPr>
                   <pic:blipFill>
-                    <a:blip r:embed="rId23"/>
+                    <a:blip r:embed="rId18"/>
                     <a:stretch>
                       <a:fillRect/>
                     </a:stretch>
@@ -1157,8 +953,8 @@
       <w:r>
         <w:drawing>
           <wp:inline xmlns:a="http://schemas.openxmlformats.org/drawingml/2006/main" xmlns:pic="http://schemas.openxmlformats.org/drawingml/2006/picture">
-            <wp:extent cx="1009497" cy="826617"/>
-            <wp:docPr id="15" name="Picture 15"/>
+            <wp:extent cx="819302" cy="577900"/>
+            <wp:docPr id="10" name="Picture 10"/>
             <wp:cNvGraphicFramePr>
               <a:graphicFrameLocks noChangeAspect="1"/>
             </wp:cNvGraphicFramePr>
@@ -1170,7 +966,7 @@
                     <pic:cNvPicPr/>
                   </pic:nvPicPr>
                   <pic:blipFill>
-                    <a:blip r:embed="rId24"/>
+                    <a:blip r:embed="rId19"/>
                     <a:stretch>
                       <a:fillRect/>
                     </a:stretch>
@@ -1178,46 +974,7 @@
                   <pic:spPr>
                     <a:xfrm>
                       <a:off x="0" y="0"/>
-                      <a:ext cx="1009497" cy="826617"/>
-                    </a:xfrm>
-                    <a:prstGeom prst="rect"/>
-                  </pic:spPr>
-                </pic:pic>
-              </a:graphicData>
-            </a:graphic>
-          </wp:inline>
-        </w:drawing>
-      </w:r>
-    </w:p>
-    <w:p>
-      <w:pPr>
-        <w:jc w:val="center"/>
-      </w:pPr>
-      <w:r>
-        <w:drawing>
-          <wp:inline xmlns:a="http://schemas.openxmlformats.org/drawingml/2006/main" xmlns:pic="http://schemas.openxmlformats.org/drawingml/2006/picture">
-            <wp:extent cx="2220163" cy="731520"/>
-            <wp:docPr id="16" name="Picture 16"/>
-            <wp:cNvGraphicFramePr>
-              <a:graphicFrameLocks noChangeAspect="1"/>
-            </wp:cNvGraphicFramePr>
-            <a:graphic>
-              <a:graphicData uri="http://schemas.openxmlformats.org/drawingml/2006/picture">
-                <pic:pic>
-                  <pic:nvPicPr>
-                    <pic:cNvPr id="0" name="fcm_u.png"/>
-                    <pic:cNvPicPr/>
-                  </pic:nvPicPr>
-                  <pic:blipFill>
-                    <a:blip r:embed="rId25"/>
-                    <a:stretch>
-                      <a:fillRect/>
-                    </a:stretch>
-                  </pic:blipFill>
-                  <pic:spPr>
-                    <a:xfrm>
-                      <a:off x="0" y="0"/>
-                      <a:ext cx="2220163" cy="731520"/>
+                      <a:ext cx="819302" cy="577900"/>
                     </a:xfrm>
                     <a:prstGeom prst="rect"/>
                   </pic:spPr>
@@ -1245,7 +1002,7 @@
         <w:drawing>
           <wp:inline xmlns:a="http://schemas.openxmlformats.org/drawingml/2006/main" xmlns:pic="http://schemas.openxmlformats.org/drawingml/2006/picture">
             <wp:extent cx="4572000" cy="1371600"/>
-            <wp:docPr id="17" name="Picture 17"/>
+            <wp:docPr id="11" name="Picture 11"/>
             <wp:cNvGraphicFramePr>
               <a:graphicFrameLocks noChangeAspect="1"/>
             </wp:cNvGraphicFramePr>
@@ -1257,7 +1014,7 @@
                     <pic:cNvPicPr/>
                   </pic:nvPicPr>
                   <pic:blipFill>
-                    <a:blip r:embed="rId26"/>
+                    <a:blip r:embed="rId20"/>
                     <a:stretch>
                       <a:fillRect/>
                     </a:stretch>
@@ -1497,7 +1254,7 @@
         <w:drawing>
           <wp:inline xmlns:a="http://schemas.openxmlformats.org/drawingml/2006/main" xmlns:pic="http://schemas.openxmlformats.org/drawingml/2006/picture">
             <wp:extent cx="5943600" cy="1188720"/>
-            <wp:docPr id="18" name="Picture 18"/>
+            <wp:docPr id="12" name="Picture 12"/>
             <wp:cNvGraphicFramePr>
               <a:graphicFrameLocks noChangeAspect="1"/>
             </wp:cNvGraphicFramePr>
@@ -1509,7 +1266,7 @@
                     <pic:cNvPicPr/>
                   </pic:nvPicPr>
                   <pic:blipFill>
-                    <a:blip r:embed="rId27"/>
+                    <a:blip r:embed="rId21"/>
                     <a:stretch>
                       <a:fillRect/>
                     </a:stretch>
@@ -1564,7 +1321,7 @@
         <w:drawing>
           <wp:inline xmlns:a="http://schemas.openxmlformats.org/drawingml/2006/main" xmlns:pic="http://schemas.openxmlformats.org/drawingml/2006/picture">
             <wp:extent cx="5669280" cy="3342736"/>
-            <wp:docPr id="19" name="Picture 19"/>
+            <wp:docPr id="13" name="Picture 13"/>
             <wp:cNvGraphicFramePr>
               <a:graphicFrameLocks noChangeAspect="1"/>
             </wp:cNvGraphicFramePr>
@@ -1576,7 +1333,7 @@
                     <pic:cNvPicPr/>
                   </pic:nvPicPr>
                   <pic:blipFill>
-                    <a:blip r:embed="rId28"/>
+                    <a:blip r:embed="rId22"/>
                     <a:stretch>
                       <a:fillRect/>
                     </a:stretch>
@@ -1614,7 +1371,7 @@
         <w:drawing>
           <wp:inline xmlns:a="http://schemas.openxmlformats.org/drawingml/2006/main" xmlns:pic="http://schemas.openxmlformats.org/drawingml/2006/picture">
             <wp:extent cx="5943600" cy="2834640"/>
-            <wp:docPr id="20" name="Picture 20"/>
+            <wp:docPr id="14" name="Picture 14"/>
             <wp:cNvGraphicFramePr>
               <a:graphicFrameLocks noChangeAspect="1"/>
             </wp:cNvGraphicFramePr>
@@ -1626,7 +1383,7 @@
                     <pic:cNvPicPr/>
                   </pic:nvPicPr>
                   <pic:blipFill>
-                    <a:blip r:embed="rId29"/>
+                    <a:blip r:embed="rId23"/>
                     <a:stretch>
                       <a:fillRect/>
                     </a:stretch>
@@ -1976,7 +1733,7 @@
         <w:drawing>
           <wp:inline xmlns:a="http://schemas.openxmlformats.org/drawingml/2006/main" xmlns:pic="http://schemas.openxmlformats.org/drawingml/2006/picture">
             <wp:extent cx="4754880" cy="4226560"/>
-            <wp:docPr id="21" name="Picture 21"/>
+            <wp:docPr id="15" name="Picture 15"/>
             <wp:cNvGraphicFramePr>
               <a:graphicFrameLocks noChangeAspect="1"/>
             </wp:cNvGraphicFramePr>
@@ -1988,7 +1745,7 @@
                     <pic:cNvPicPr/>
                   </pic:nvPicPr>
                   <pic:blipFill>
-                    <a:blip r:embed="rId30"/>
+                    <a:blip r:embed="rId24"/>
                     <a:stretch>
                       <a:fillRect/>
                     </a:stretch>
@@ -2026,7 +1783,7 @@
         <w:drawing>
           <wp:inline xmlns:a="http://schemas.openxmlformats.org/drawingml/2006/main" xmlns:pic="http://schemas.openxmlformats.org/drawingml/2006/picture">
             <wp:extent cx="5760720" cy="1920240"/>
-            <wp:docPr id="22" name="Picture 22"/>
+            <wp:docPr id="16" name="Picture 16"/>
             <wp:cNvGraphicFramePr>
               <a:graphicFrameLocks noChangeAspect="1"/>
             </wp:cNvGraphicFramePr>
@@ -2038,7 +1795,7 @@
                     <pic:cNvPicPr/>
                   </pic:nvPicPr>
                   <pic:blipFill>
-                    <a:blip r:embed="rId31"/>
+                    <a:blip r:embed="rId25"/>
                     <a:stretch>
                       <a:fillRect/>
                     </a:stretch>
@@ -2336,7 +2093,7 @@
         <w:drawing>
           <wp:inline xmlns:a="http://schemas.openxmlformats.org/drawingml/2006/main" xmlns:pic="http://schemas.openxmlformats.org/drawingml/2006/picture">
             <wp:extent cx="5760720" cy="1843430"/>
-            <wp:docPr id="23" name="Picture 23"/>
+            <wp:docPr id="17" name="Picture 17"/>
             <wp:cNvGraphicFramePr>
               <a:graphicFrameLocks noChangeAspect="1"/>
             </wp:cNvGraphicFramePr>
@@ -2348,7 +2105,7 @@
                     <pic:cNvPicPr/>
                   </pic:nvPicPr>
                   <pic:blipFill>
-                    <a:blip r:embed="rId32"/>
+                    <a:blip r:embed="rId26"/>
                     <a:stretch>
                       <a:fillRect/>
                     </a:stretch>

</xml_diff>